<commit_message>
feat: apply all sections
</commit_message>
<xml_diff>
--- a/app/doc_generator/complaint_docx/templates/complaint_template.docx
+++ b/app/doc_generator/complaint_docx/templates/complaint_template.docx
@@ -1635,136 +1635,174 @@
                 <w:sz w:val="24"/>
                 <w:szCs w:val="24"/>
               </w:rPr>
+              <w:t xml:space="preserve">{</w:t>
+            </w:r>
+            <w:r>
+              <w:rPr>
+                <w:rFonts w:ascii="Batang" w:hAnsi="Batang" w:eastAsia="Batang" w:cs="Batang"/>
+                <w:color w:val="000000"/>
+                <w:kern w:val="0"/>
+                <w:sz w:val="24"/>
+                <w:szCs w:val="24"/>
+              </w:rPr>
+              <w:t xml:space="preserve">{ </w:t>
+            </w:r>
+            <w:r>
+              <w:rPr>
+                <w:rFonts w:ascii="Batang" w:hAnsi="Batang" w:eastAsia="Batang" w:cs="Batang"/>
+                <w:color w:val="000000"/>
+                <w:kern w:val="0"/>
+                <w:sz w:val="24"/>
+                <w:szCs w:val="24"/>
+              </w:rPr>
+              <w:t xml:space="preserve">is_</w:t>
+            </w:r>
+            <w:r>
+              <w:rPr>
+                <w:rFonts w:ascii="Batang" w:hAnsi="Batang" w:eastAsia="Batang" w:cs="Batang"/>
+                <w:color w:val="000000"/>
+                <w:kern w:val="0"/>
+                <w:sz w:val="24"/>
+                <w:szCs w:val="24"/>
+              </w:rPr>
+              <w:t xml:space="preserve">rep</w:t>
+            </w:r>
+            <w:r>
+              <w:rPr>
+                <w:rFonts w:ascii="Batang" w:hAnsi="Batang" w:eastAsia="Batang" w:cs="Batang"/>
+                <w:color w:val="000000"/>
+                <w:kern w:val="0"/>
+                <w:sz w:val="24"/>
+                <w:szCs w:val="24"/>
+              </w:rPr>
+              <w:t xml:space="preserve"> </w:t>
+            </w:r>
+            <w:r>
+              <w:rPr>
+                <w:rFonts w:ascii="Batang" w:hAnsi="Batang" w:eastAsia="Batang" w:cs="Batang"/>
+                <w:color w:val="000000"/>
+                <w:kern w:val="0"/>
+                <w:sz w:val="24"/>
+                <w:szCs w:val="24"/>
+              </w:rPr>
+              <w:t xml:space="preserve">}</w:t>
+            </w:r>
+            <w:r>
+              <w:rPr>
+                <w:rFonts w:ascii="Batang" w:hAnsi="Batang" w:eastAsia="Batang" w:cs="Batang"/>
+                <w:color w:val="000000"/>
+                <w:kern w:val="0"/>
+                <w:sz w:val="24"/>
+                <w:szCs w:val="24"/>
+              </w:rPr>
+              <w:t xml:space="preserve">}</w:t>
+            </w:r>
+            <w:r>
+              <w:rPr>
+                <w:rFonts w:ascii="Batang" w:hAnsi="Batang" w:eastAsia="Batang" w:cs="Batang"/>
+                <w:color w:val="000000"/>
+                <w:kern w:val="0"/>
+                <w:sz w:val="24"/>
+                <w:szCs w:val="24"/>
+              </w:rPr>
+              <w:t xml:space="preserve"> </w:t>
+            </w:r>
+            <w:r>
+              <w:rPr>
+                <w:rFonts w:ascii="Batang" w:hAnsi="Batang" w:eastAsia="Batang" w:cs="Batang"/>
+                <w:color w:val="000000"/>
+                <w:kern w:val="0"/>
+                <w:sz w:val="24"/>
+                <w:szCs w:val="24"/>
+              </w:rPr>
+              <w:t xml:space="preserve">법정대리인</w:t>
+            </w:r>
+            <w:r>
+              <w:rPr>
+                <w:rFonts w:ascii="Batang" w:hAnsi="Batang" w:eastAsia="Batang" w:cs="Batang"/>
+                <w:color w:val="000000"/>
+                <w:kern w:val="0"/>
+                <w:sz w:val="24"/>
+                <w:szCs w:val="24"/>
+              </w:rPr>
+              <w:t xml:space="preserve"> </w:t>
+            </w:r>
+            <w:r>
+              <w:rPr>
+                <w:rFonts w:ascii="Batang" w:hAnsi="Batang" w:eastAsia="Batang" w:cs="Batang"/>
+                <w:color w:val="000000"/>
+                <w:kern w:val="0"/>
+                <w:sz w:val="24"/>
+                <w:szCs w:val="24"/>
+              </w:rPr>
+              <w:t>(</w:t>
+            </w:r>
+            <w:r>
+              <w:rPr>
+                <w:rFonts w:ascii="Batang" w:hAnsi="Batang" w:eastAsia="Batang" w:cs="Batang"/>
+                <w:color w:val="000000"/>
+                <w:kern w:val="0"/>
+                <w:sz w:val="24"/>
+                <w:szCs w:val="24"/>
+              </w:rPr>
+              <w:t xml:space="preserve">성명</w:t>
+            </w:r>
+            <w:r>
+              <w:rPr>
+                <w:rFonts w:ascii="Batang" w:hAnsi="Batang" w:eastAsia="Batang" w:cs="Batang"/>
+                <w:color w:val="000000"/>
+                <w:kern w:val="0"/>
+                <w:sz w:val="24"/>
+                <w:szCs w:val="24"/>
+              </w:rPr>
+              <w:t xml:space="preserve"> </w:t>
+            </w:r>
+            <w:r>
+              <w:rPr>
+                <w:rFonts w:ascii="Batang" w:hAnsi="Batang" w:eastAsia="Batang" w:cs="Batang"/>
+                <w:color w:val="000000"/>
+                <w:kern w:val="0"/>
+                <w:sz w:val="24"/>
+                <w:szCs w:val="24"/>
+              </w:rPr>
+              <w:t>:</w:t>
+            </w:r>
+            <w:r>
+              <w:rPr>
+                <w:rFonts w:ascii="Batang" w:hAnsi="Batang" w:eastAsia="Batang" w:cs="Batang"/>
+                <w:color w:val="000000"/>
+                <w:kern w:val="0"/>
+                <w:sz w:val="24"/>
+                <w:szCs w:val="24"/>
+              </w:rPr>
+              <w:t xml:space="preserve"> </w:t>
+            </w:r>
+            <w:r>
+              <w:rPr>
+                <w:rFonts w:ascii="Batang" w:hAnsi="Batang" w:eastAsia="Batang" w:cs="Batang"/>
+                <w:color w:val="000000" w:themeColor="text1" w:themeTint="FF" w:themeShade="FF"/>
+                <w:sz w:val="24"/>
+                <w:szCs w:val="24"/>
+              </w:rPr>
               <w:t xml:space="preserve">{{ </w:t>
             </w:r>
             <w:r>
               <w:rPr>
                 <w:rFonts w:ascii="Batang" w:hAnsi="Batang" w:eastAsia="Batang" w:cs="Batang"/>
-                <w:color w:val="000000"/>
-                <w:kern w:val="0"/>
-                <w:sz w:val="24"/>
-                <w:szCs w:val="24"/>
-              </w:rPr>
-              <w:t xml:space="preserve">is_rep</w:t>
-            </w:r>
-            <w:r>
-              <w:rPr>
-                <w:rFonts w:ascii="Batang" w:hAnsi="Batang" w:eastAsia="Batang" w:cs="Batang"/>
-                <w:color w:val="000000"/>
-                <w:kern w:val="0"/>
-                <w:sz w:val="24"/>
-                <w:szCs w:val="24"/>
-              </w:rPr>
-              <w:t xml:space="preserve"> </w:t>
-            </w:r>
-            <w:r>
-              <w:rPr>
-                <w:rFonts w:ascii="Batang" w:hAnsi="Batang" w:eastAsia="Batang" w:cs="Batang"/>
-                <w:color w:val="000000"/>
-                <w:kern w:val="0"/>
-                <w:sz w:val="24"/>
-                <w:szCs w:val="24"/>
-              </w:rPr>
-              <w:t xml:space="preserve">}</w:t>
-            </w:r>
-            <w:r>
-              <w:rPr>
-                <w:rFonts w:ascii="Batang" w:hAnsi="Batang" w:eastAsia="Batang" w:cs="Batang"/>
-                <w:color w:val="000000"/>
-                <w:kern w:val="0"/>
-                <w:sz w:val="24"/>
-                <w:szCs w:val="24"/>
-              </w:rPr>
-              <w:t xml:space="preserve">}</w:t>
-            </w:r>
-            <w:r>
-              <w:rPr>
-                <w:rFonts w:ascii="Batang" w:hAnsi="Batang" w:eastAsia="Batang" w:cs="Batang"/>
-                <w:color w:val="000000"/>
-                <w:kern w:val="0"/>
-                <w:sz w:val="24"/>
-                <w:szCs w:val="24"/>
-              </w:rPr>
-              <w:t xml:space="preserve"> </w:t>
-            </w:r>
-            <w:r>
-              <w:rPr>
-                <w:rFonts w:ascii="Batang" w:hAnsi="Batang" w:eastAsia="Batang" w:cs="Batang"/>
-                <w:color w:val="000000"/>
-                <w:kern w:val="0"/>
-                <w:sz w:val="24"/>
-                <w:szCs w:val="24"/>
-              </w:rPr>
-              <w:t xml:space="preserve">법정대리인</w:t>
-            </w:r>
-            <w:r>
-              <w:rPr>
-                <w:rFonts w:ascii="Batang" w:hAnsi="Batang" w:eastAsia="Batang" w:cs="Batang"/>
-                <w:color w:val="000000"/>
-                <w:kern w:val="0"/>
-                <w:sz w:val="24"/>
-                <w:szCs w:val="24"/>
-              </w:rPr>
-              <w:t xml:space="preserve"> </w:t>
-            </w:r>
-            <w:r>
-              <w:rPr>
-                <w:rFonts w:ascii="Batang" w:hAnsi="Batang" w:eastAsia="Batang" w:cs="Batang"/>
-                <w:color w:val="000000"/>
-                <w:kern w:val="0"/>
-                <w:sz w:val="24"/>
-                <w:szCs w:val="24"/>
-              </w:rPr>
-              <w:t>(</w:t>
-            </w:r>
-            <w:r>
-              <w:rPr>
-                <w:rFonts w:ascii="Batang" w:hAnsi="Batang" w:eastAsia="Batang" w:cs="Batang"/>
-                <w:color w:val="000000"/>
-                <w:kern w:val="0"/>
-                <w:sz w:val="24"/>
-                <w:szCs w:val="24"/>
-              </w:rPr>
-              <w:t xml:space="preserve">성명</w:t>
-            </w:r>
-            <w:r>
-              <w:rPr>
-                <w:rFonts w:ascii="Batang" w:hAnsi="Batang" w:eastAsia="Batang" w:cs="Batang"/>
-                <w:color w:val="000000"/>
-                <w:kern w:val="0"/>
-                <w:sz w:val="24"/>
-                <w:szCs w:val="24"/>
-              </w:rPr>
-              <w:t xml:space="preserve"> </w:t>
-            </w:r>
-            <w:r>
-              <w:rPr>
-                <w:rFonts w:ascii="Batang" w:hAnsi="Batang" w:eastAsia="Batang" w:cs="Batang"/>
-                <w:color w:val="000000"/>
-                <w:kern w:val="0"/>
-                <w:sz w:val="24"/>
-                <w:szCs w:val="24"/>
-              </w:rPr>
-              <w:t>:</w:t>
-            </w:r>
-            <w:r>
-              <w:rPr>
-                <w:rFonts w:ascii="Batang" w:hAnsi="Batang" w:eastAsia="Batang" w:cs="Batang"/>
-                <w:color w:val="000000"/>
-                <w:kern w:val="0"/>
-                <w:sz w:val="24"/>
-                <w:szCs w:val="24"/>
-              </w:rPr>
-              <w:t xml:space="preserve"> </w:t>
-            </w:r>
-            <w:r>
-              <w:rPr>
-                <w:rFonts w:ascii="Batang" w:hAnsi="Batang" w:eastAsia="Batang" w:cs="Batang"/>
-                <w:color w:val="000000" w:themeColor="text1" w:themeTint="FF" w:themeShade="FF"/>
-                <w:sz w:val="24"/>
-                <w:szCs w:val="24"/>
-              </w:rPr>
-              <w:t>{{ rep_n }}</w:t>
+                <w:color w:val="000000" w:themeColor="text1" w:themeTint="FF" w:themeShade="FF"/>
+                <w:sz w:val="24"/>
+                <w:szCs w:val="24"/>
+              </w:rPr>
+              <w:t>rep_n</w:t>
+            </w:r>
+            <w:r>
+              <w:rPr>
+                <w:rFonts w:ascii="Batang" w:hAnsi="Batang" w:eastAsia="Batang" w:cs="Batang"/>
+                <w:color w:val="000000" w:themeColor="text1" w:themeTint="FF" w:themeShade="FF"/>
+                <w:sz w:val="24"/>
+                <w:szCs w:val="24"/>
+              </w:rPr>
+              <w:t xml:space="preserve"> }}</w:t>
             </w:r>
             <w:r>
               <w:rPr>
@@ -1859,6 +1897,136 @@
                 <w:sz w:val="24"/>
                 <w:szCs w:val="24"/>
               </w:rPr>
+              <w:t xml:space="preserve">{</w:t>
+            </w:r>
+            <w:r>
+              <w:rPr>
+                <w:rFonts w:ascii="Batang" w:hAnsi="Batang" w:eastAsia="Batang" w:cs="Batang"/>
+                <w:color w:val="000000"/>
+                <w:kern w:val="0"/>
+                <w:sz w:val="24"/>
+                <w:szCs w:val="24"/>
+              </w:rPr>
+              <w:t xml:space="preserve">{ </w:t>
+            </w:r>
+            <w:r>
+              <w:rPr>
+                <w:rFonts w:ascii="Batang" w:hAnsi="Batang" w:eastAsia="Batang" w:cs="Batang"/>
+                <w:color w:val="000000"/>
+                <w:kern w:val="0"/>
+                <w:sz w:val="24"/>
+                <w:szCs w:val="24"/>
+              </w:rPr>
+              <w:t xml:space="preserve">is_</w:t>
+            </w:r>
+            <w:r>
+              <w:rPr>
+                <w:rFonts w:ascii="Batang" w:hAnsi="Batang" w:eastAsia="Batang" w:cs="Batang"/>
+                <w:color w:val="000000"/>
+                <w:kern w:val="0"/>
+                <w:sz w:val="24"/>
+                <w:szCs w:val="24"/>
+              </w:rPr>
+              <w:t xml:space="preserve">law</w:t>
+            </w:r>
+            <w:r>
+              <w:rPr>
+                <w:rFonts w:ascii="Batang" w:hAnsi="Batang" w:eastAsia="Batang" w:cs="Batang"/>
+                <w:color w:val="000000"/>
+                <w:kern w:val="0"/>
+                <w:sz w:val="24"/>
+                <w:szCs w:val="24"/>
+              </w:rPr>
+              <w:t xml:space="preserve"> </w:t>
+            </w:r>
+            <w:r>
+              <w:rPr>
+                <w:rFonts w:ascii="Batang" w:hAnsi="Batang" w:eastAsia="Batang" w:cs="Batang"/>
+                <w:color w:val="000000"/>
+                <w:kern w:val="0"/>
+                <w:sz w:val="24"/>
+                <w:szCs w:val="24"/>
+              </w:rPr>
+              <w:t xml:space="preserve">}}</w:t>
+            </w:r>
+            <w:r>
+              <w:rPr>
+                <w:rFonts w:ascii="Batang" w:hAnsi="Batang" w:eastAsia="Batang" w:cs="Batang"/>
+                <w:color w:val="000000"/>
+                <w:kern w:val="0"/>
+                <w:sz w:val="24"/>
+                <w:szCs w:val="24"/>
+              </w:rPr>
+              <w:t xml:space="preserve"> </w:t>
+            </w:r>
+            <w:r>
+              <w:rPr>
+                <w:rFonts w:ascii="Batang" w:hAnsi="Batang" w:eastAsia="Batang" w:cs="Batang"/>
+                <w:color w:val="000000"/>
+                <w:kern w:val="0"/>
+                <w:sz w:val="24"/>
+                <w:szCs w:val="24"/>
+              </w:rPr>
+              <w:t xml:space="preserve">고소대리인</w:t>
+            </w:r>
+            <w:r>
+              <w:rPr>
+                <w:rFonts w:ascii="Batang" w:hAnsi="Batang" w:eastAsia="Batang" w:cs="Batang"/>
+                <w:color w:val="000000"/>
+                <w:kern w:val="0"/>
+                <w:sz w:val="24"/>
+                <w:szCs w:val="24"/>
+              </w:rPr>
+              <w:t xml:space="preserve"> </w:t>
+            </w:r>
+            <w:r>
+              <w:rPr>
+                <w:rFonts w:ascii="Batang" w:hAnsi="Batang" w:eastAsia="Batang" w:cs="Batang"/>
+                <w:color w:val="000000"/>
+                <w:kern w:val="0"/>
+                <w:sz w:val="24"/>
+                <w:szCs w:val="24"/>
+              </w:rPr>
+              <w:t>(</w:t>
+            </w:r>
+            <w:r>
+              <w:rPr>
+                <w:rFonts w:ascii="Batang" w:hAnsi="Batang" w:eastAsia="Batang" w:cs="Batang"/>
+                <w:color w:val="000000"/>
+                <w:kern w:val="0"/>
+                <w:sz w:val="24"/>
+                <w:szCs w:val="24"/>
+              </w:rPr>
+              <w:t xml:space="preserve">성명 </w:t>
+            </w:r>
+            <w:r>
+              <w:rPr>
+                <w:rFonts w:ascii="Batang" w:hAnsi="Batang" w:eastAsia="Batang" w:cs="Batang"/>
+                <w:color w:val="000000"/>
+                <w:kern w:val="0"/>
+                <w:sz w:val="24"/>
+                <w:szCs w:val="24"/>
+              </w:rPr>
+              <w:t>:</w:t>
+            </w:r>
+            <w:r>
+              <w:rPr>
+                <w:rFonts w:ascii="Batang" w:hAnsi="Batang" w:eastAsia="Batang" w:cs="Batang"/>
+                <w:color w:val="000000"/>
+                <w:kern w:val="0"/>
+                <w:sz w:val="24"/>
+                <w:szCs w:val="24"/>
+              </w:rPr>
+              <w:t xml:space="preserve"> </w:t>
+            </w:r>
+            <w:r>
+              <w:rPr>
+                <w:rFonts w:ascii="Batang" w:hAnsi="Batang" w:eastAsia="Batang" w:cs="Batang"/>
+                <w:color w:val="000000"/>
+                <w:kern w:val="0"/>
+                <w:sz w:val="24"/>
+                <w:szCs w:val="24"/>
+              </w:rPr>
               <w:t xml:space="preserve">{{ </w:t>
             </w:r>
             <w:r>
@@ -1869,7 +2037,37 @@
                 <w:sz w:val="24"/>
                 <w:szCs w:val="24"/>
               </w:rPr>
-              <w:t xml:space="preserve">is_law</w:t>
+              <w:t xml:space="preserve">law_n</w:t>
+            </w:r>
+            <w:r>
+              <w:rPr>
+                <w:rFonts w:ascii="Batang" w:hAnsi="Batang" w:eastAsia="Batang" w:cs="Batang"/>
+                <w:color w:val="000000"/>
+                <w:kern w:val="0"/>
+                <w:sz w:val="24"/>
+                <w:szCs w:val="24"/>
+              </w:rPr>
+              <w:t xml:space="preserve"> }} </w:t>
+            </w:r>
+            <w:r>
+              <w:rPr>
+                <w:rFonts w:ascii="Batang" w:hAnsi="Batang" w:eastAsia="Batang" w:cs="Batang"/>
+                <w:color w:val="000000"/>
+                <w:kern w:val="0"/>
+                <w:sz w:val="24"/>
+                <w:szCs w:val="24"/>
+              </w:rPr>
+              <w:t xml:space="preserve">변</w:t>
+            </w:r>
+            <w:r>
+              <w:rPr>
+                <w:rFonts w:ascii="Batang" w:hAnsi="Batang" w:eastAsia="Batang" w:cs="Batang"/>
+                <w:color w:val="000000"/>
+                <w:kern w:val="0"/>
+                <w:sz w:val="24"/>
+                <w:szCs w:val="24"/>
+              </w:rPr>
+              <w:t xml:space="preserve">호사</w:t>
             </w:r>
             <w:r>
               <w:rPr>
@@ -1889,7 +2087,7 @@
                 <w:sz w:val="24"/>
                 <w:szCs w:val="24"/>
               </w:rPr>
-              <w:t xml:space="preserve">}}</w:t>
+              <w:t xml:space="preserve">,</w:t>
             </w:r>
             <w:r>
               <w:rPr>
@@ -1909,7 +2107,37 @@
                 <w:sz w:val="24"/>
                 <w:szCs w:val="24"/>
               </w:rPr>
-              <w:t xml:space="preserve">고소대리인</w:t>
+              <w:t xml:space="preserve">연락처 </w:t>
+            </w:r>
+            <w:r>
+              <w:rPr>
+                <w:rFonts w:ascii="Batang" w:hAnsi="Batang" w:eastAsia="Batang" w:cs="Batang"/>
+                <w:color w:val="000000"/>
+                <w:kern w:val="0"/>
+                <w:sz w:val="24"/>
+                <w:szCs w:val="24"/>
+              </w:rPr>
+              <w:t xml:space="preserve">{{ </w:t>
+            </w:r>
+            <w:r>
+              <w:rPr>
+                <w:rFonts w:ascii="Batang" w:hAnsi="Batang" w:eastAsia="Batang" w:cs="Batang"/>
+                <w:color w:val="000000"/>
+                <w:kern w:val="0"/>
+                <w:sz w:val="24"/>
+                <w:szCs w:val="24"/>
+              </w:rPr>
+              <w:t xml:space="preserve">l</w:t>
+            </w:r>
+            <w:r>
+              <w:rPr>
+                <w:rFonts w:ascii="Batang" w:hAnsi="Batang" w:eastAsia="Batang" w:cs="Batang"/>
+                <w:color w:val="000000"/>
+                <w:kern w:val="0"/>
+                <w:sz w:val="24"/>
+                <w:szCs w:val="24"/>
+              </w:rPr>
+              <w:t xml:space="preserve">aw_c</w:t>
             </w:r>
             <w:r>
               <w:rPr>
@@ -1929,117 +2157,7 @@
                 <w:sz w:val="24"/>
                 <w:szCs w:val="24"/>
               </w:rPr>
-              <w:t>(</w:t>
-            </w:r>
-            <w:r>
-              <w:rPr>
-                <w:rFonts w:ascii="Batang" w:hAnsi="Batang" w:eastAsia="Batang" w:cs="Batang"/>
-                <w:color w:val="000000"/>
-                <w:kern w:val="0"/>
-                <w:sz w:val="24"/>
-                <w:szCs w:val="24"/>
-              </w:rPr>
-              <w:t xml:space="preserve">성명 </w:t>
-            </w:r>
-            <w:r>
-              <w:rPr>
-                <w:rFonts w:ascii="Batang" w:hAnsi="Batang" w:eastAsia="Batang" w:cs="Batang"/>
-                <w:color w:val="000000"/>
-                <w:kern w:val="0"/>
-                <w:sz w:val="24"/>
-                <w:szCs w:val="24"/>
-              </w:rPr>
-              <w:t>:</w:t>
-            </w:r>
-            <w:r>
-              <w:rPr>
-                <w:rFonts w:ascii="Batang" w:hAnsi="Batang" w:eastAsia="Batang" w:cs="Batang"/>
-                <w:color w:val="000000"/>
-                <w:kern w:val="0"/>
-                <w:sz w:val="24"/>
-                <w:szCs w:val="24"/>
-              </w:rPr>
-              <w:t xml:space="preserve"> </w:t>
-            </w:r>
-            <w:r>
-              <w:rPr>
-                <w:rFonts w:ascii="Batang" w:hAnsi="Batang" w:eastAsia="Batang" w:cs="Batang"/>
-                <w:color w:val="000000"/>
-                <w:kern w:val="0"/>
-                <w:sz w:val="24"/>
-                <w:szCs w:val="24"/>
-              </w:rPr>
-              <w:t xml:space="preserve">{{ law_n }} </w:t>
-            </w:r>
-            <w:r>
-              <w:rPr>
-                <w:rFonts w:ascii="Batang" w:hAnsi="Batang" w:eastAsia="Batang" w:cs="Batang"/>
-                <w:color w:val="000000"/>
-                <w:kern w:val="0"/>
-                <w:sz w:val="24"/>
-                <w:szCs w:val="24"/>
-              </w:rPr>
-              <w:t xml:space="preserve">변호사 </w:t>
-            </w:r>
-            <w:r>
-              <w:rPr>
-                <w:rFonts w:ascii="Batang" w:hAnsi="Batang" w:eastAsia="Batang" w:cs="Batang"/>
-                <w:color w:val="000000"/>
-                <w:kern w:val="0"/>
-                <w:sz w:val="24"/>
-                <w:szCs w:val="24"/>
-              </w:rPr>
-              <w:t xml:space="preserve">,</w:t>
-            </w:r>
-            <w:r>
-              <w:rPr>
-                <w:rFonts w:ascii="Batang" w:hAnsi="Batang" w:eastAsia="Batang" w:cs="Batang"/>
-                <w:color w:val="000000"/>
-                <w:kern w:val="0"/>
-                <w:sz w:val="24"/>
-                <w:szCs w:val="24"/>
-              </w:rPr>
-              <w:t xml:space="preserve"> </w:t>
-            </w:r>
-            <w:r>
-              <w:rPr>
-                <w:rFonts w:ascii="Batang" w:hAnsi="Batang" w:eastAsia="Batang" w:cs="Batang"/>
-                <w:color w:val="000000"/>
-                <w:kern w:val="0"/>
-                <w:sz w:val="24"/>
-                <w:szCs w:val="24"/>
-              </w:rPr>
-              <w:t xml:space="preserve">연락처 </w:t>
-            </w:r>
-            <w:r>
-              <w:rPr>
-                <w:rFonts w:ascii="Batang" w:hAnsi="Batang" w:eastAsia="Batang" w:cs="Batang"/>
-                <w:color w:val="000000"/>
-                <w:kern w:val="0"/>
-                <w:sz w:val="24"/>
-                <w:szCs w:val="24"/>
-              </w:rPr>
-              <w:t xml:space="preserve">{{ </w:t>
-            </w:r>
-            <w:r>
-              <w:rPr>
-                <w:rFonts w:ascii="Batang" w:hAnsi="Batang" w:eastAsia="Batang" w:cs="Batang"/>
-                <w:color w:val="000000"/>
-                <w:kern w:val="0"/>
-                <w:sz w:val="24"/>
-                <w:szCs w:val="24"/>
-              </w:rPr>
-              <w:t xml:space="preserve">law_c</w:t>
-            </w:r>
-            <w:r>
-              <w:rPr>
-                <w:rFonts w:ascii="Batang" w:hAnsi="Batang" w:eastAsia="Batang" w:cs="Batang"/>
-                <w:color w:val="000000"/>
-                <w:kern w:val="0"/>
-                <w:sz w:val="24"/>
-                <w:szCs w:val="24"/>
-              </w:rPr>
-              <w:t xml:space="preserve"> }} </w:t>
+              <w:t xml:space="preserve">}} </w:t>
             </w:r>
             <w:r>
               <w:rPr>
@@ -2190,6 +2308,7 @@
           <w:kern w:val="0"/>
           <w:sz w:val="30"/>
           <w:szCs w:val="30"/>
+          <w:vertAlign w:val="superscript"/>
         </w:rPr>
       </w:pPr>
       <w:r>
@@ -3543,6 +3662,7 @@
           <w:bCs w:val="1"/>
           <w:sz w:val="30"/>
           <w:szCs w:val="30"/>
+          <w:vertAlign w:val="superscript"/>
         </w:rPr>
       </w:pPr>
       <w:r>
@@ -3572,6 +3692,7 @@
           <w:bCs w:val="1"/>
           <w:sz w:val="30"/>
           <w:szCs w:val="30"/>
+          <w:vertAlign w:val="superscript"/>
         </w:rPr>
         <w:t>*</w:t>
       </w:r>
@@ -3642,7 +3763,7 @@
           <w:sz w:val="24"/>
           <w:szCs w:val="24"/>
         </w:rPr>
-        <w:t>경계침범</w:t>
+        <w:t xml:space="preserve">스토킹범</w:t>
       </w:r>
       <w:r>
         <w:rPr>
@@ -3660,7 +3781,7 @@
           <w:sz w:val="24"/>
           <w:szCs w:val="24"/>
         </w:rPr>
-        <w:t xml:space="preserve"> 및 </w:t>
+        <w:t>의 처벌 등에 관한 법률 위반으로</w:t>
       </w:r>
       <w:r>
         <w:rPr>
@@ -3669,7 +3790,7 @@
           <w:sz w:val="24"/>
           <w:szCs w:val="24"/>
         </w:rPr>
-        <w:t>재물손괴죄</w:t>
+        <w:t xml:space="preserve"> </w:t>
       </w:r>
       <w:r>
         <w:rPr>
@@ -3678,7 +3799,7 @@
           <w:sz w:val="24"/>
           <w:szCs w:val="24"/>
         </w:rPr>
-        <w:t>,</w:t>
+        <w:t>고소하오니</w:t>
       </w:r>
       <w:r>
         <w:rPr>
@@ -3696,7 +3817,7 @@
           <w:sz w:val="24"/>
           <w:szCs w:val="24"/>
         </w:rPr>
-        <w:t>주거침입죄 등으</w:t>
+        <w:t xml:space="preserve">철저하게 </w:t>
       </w:r>
       <w:r>
         <w:rPr>
@@ -3705,25 +3826,7 @@
           <w:sz w:val="24"/>
           <w:szCs w:val="24"/>
         </w:rPr>
-        <w:t xml:space="preserve">로 </w:t>
-      </w:r>
-      <w:r>
-        <w:rPr>
-          <w:rFonts w:ascii="Batang" w:hAnsi="Batang" w:eastAsia="Batang" w:cs="Batang"/>
-          <w:spacing w:val="-16"/>
-          <w:sz w:val="24"/>
-          <w:szCs w:val="24"/>
-        </w:rPr>
-        <w:t>고소하오니</w:t>
-      </w:r>
-      <w:r>
-        <w:rPr>
-          <w:rFonts w:ascii="Batang" w:hAnsi="Batang" w:eastAsia="Batang" w:cs="Batang"/>
-          <w:spacing w:val="-16"/>
-          <w:sz w:val="24"/>
-          <w:szCs w:val="24"/>
-        </w:rPr>
-        <w:t xml:space="preserve"> 처벌하여 주시기</w:t>
+        <w:t xml:space="preserve">처벌하여 주시기</w:t>
       </w:r>
       <w:r>
         <w:rPr>
@@ -3774,6 +3877,7 @@
           <w:bCs w:val="1"/>
           <w:sz w:val="30"/>
           <w:szCs w:val="30"/>
+          <w:vertAlign w:val="superscript"/>
         </w:rPr>
       </w:pPr>
       <w:r>
@@ -3803,38 +3907,67 @@
           <w:bCs w:val="1"/>
           <w:sz w:val="30"/>
           <w:szCs w:val="30"/>
-        </w:rPr>
-        <w:t xml:space="preserve"> </w:t>
-      </w:r>
-      <w:r>
-        <w:rPr>
-          <w:rFonts w:ascii="Batang" w:hAnsi="Batang" w:eastAsia="Batang" w:cs="Batang"/>
-          <w:b w:val="1"/>
-          <w:bCs w:val="1"/>
-          <w:sz w:val="30"/>
-          <w:szCs w:val="30"/>
-        </w:rPr>
-        <w:t>및</w:t>
-      </w:r>
-      <w:r>
-        <w:rPr>
-          <w:rFonts w:ascii="Batang" w:hAnsi="Batang" w:eastAsia="Batang" w:cs="Batang"/>
-          <w:b w:val="1"/>
-          <w:bCs w:val="1"/>
-          <w:sz w:val="30"/>
-          <w:szCs w:val="30"/>
-        </w:rPr>
-        <w:t xml:space="preserve"> </w:t>
-      </w:r>
-      <w:r>
-        <w:rPr>
-          <w:rFonts w:ascii="Batang" w:hAnsi="Batang" w:eastAsia="Batang" w:cs="Batang"/>
-          <w:b w:val="1"/>
-          <w:bCs w:val="1"/>
-          <w:sz w:val="30"/>
-          <w:szCs w:val="30"/>
-        </w:rPr>
-        <w:t>고소이유</w:t>
+          <w:vertAlign w:val="superscript"/>
+        </w:rPr>
+        <w:t>*</w:t>
+      </w:r>
+    </w:p>
+    <w:p>
+      <w:pPr>
+        <w:pStyle w:val="a3"/>
+        <w:rPr>
+          <w:rFonts w:ascii="Batang" w:hAnsi="Batang" w:eastAsia="Batang" w:cs="Batang"/>
+          <w:sz w:val="24"/>
+          <w:szCs w:val="24"/>
+        </w:rPr>
+      </w:pPr>
+      <w:r>
+        <w:rPr>
+          <w:rFonts w:ascii="Batang" w:hAnsi="Batang" w:eastAsia="Batang" w:cs="Batang"/>
+          <w:sz w:val="24"/>
+          <w:szCs w:val="24"/>
+        </w:rPr>
+        <w:t xml:space="preserve">{{ </w:t>
+      </w:r>
+      <w:r>
+        <w:rPr>
+          <w:rFonts w:ascii="Batang" w:hAnsi="Batang" w:eastAsia="Batang" w:cs="Batang"/>
+          <w:sz w:val="24"/>
+          <w:szCs w:val="24"/>
+        </w:rPr>
+        <w:t>s</w:t>
+      </w:r>
+      <w:r>
+        <w:rPr>
+          <w:rFonts w:ascii="Batang" w:hAnsi="Batang" w:eastAsia="Batang" w:cs="Batang"/>
+          <w:sz w:val="24"/>
+          <w:szCs w:val="24"/>
+        </w:rPr>
+        <w:t>4_crime_</w:t>
+      </w:r>
+      <w:r>
+        <w:rPr>
+          <w:rFonts w:ascii="Batang" w:hAnsi="Batang" w:eastAsia="Batang" w:cs="Batang"/>
+          <w:sz w:val="24"/>
+          <w:szCs w:val="24"/>
+        </w:rPr>
+        <w:t>facts</w:t>
+      </w:r>
+      <w:r>
+        <w:rPr>
+          <w:rFonts w:ascii="Batang" w:hAnsi="Batang" w:eastAsia="Batang" w:cs="Batang"/>
+          <w:sz w:val="24"/>
+          <w:szCs w:val="24"/>
+        </w:rPr>
+        <w:t xml:space="preserve"> }</w:t>
+      </w:r>
+      <w:r>
+        <w:rPr>
+          <w:rFonts w:ascii="Batang" w:hAnsi="Batang" w:eastAsia="Batang" w:cs="Batang"/>
+          <w:sz w:val="24"/>
+          <w:szCs w:val="24"/>
+        </w:rPr>
+        <w:t>}</w:t>
       </w:r>
     </w:p>
     <w:p>
@@ -3850,17 +3983,120 @@
     <w:p>
       <w:pPr>
         <w:pStyle w:val="a3"/>
-        <w:rPr>
-          <w:rFonts w:ascii="Batang" w:hAnsi="Batang" w:eastAsia="Batang" w:cs="Batang"/>
-          <w:sz w:val="24"/>
-          <w:szCs w:val="24"/>
+        <w:spacing w:before="100" w:line="276" w:lineRule="auto"/>
+        <w:ind w:left="556" w:right="300" w:hanging="556"/>
+        <w:rPr>
+          <w:rFonts w:ascii="Batang" w:hAnsi="Batang" w:eastAsia="Batang" w:cs="Batang"/>
+          <w:sz w:val="22"/>
+          <w:szCs w:val="22"/>
+        </w:rPr>
+      </w:pPr>
+      <w:r>
+        <w:rPr>
+          <w:rFonts w:ascii="Batang" w:hAnsi="Batang" w:eastAsia="Batang" w:cs="Batang"/>
+          <w:sz w:val="22"/>
+          <w:szCs w:val="22"/>
+        </w:rPr>
+        <w:t>※ 범죄사실은 형법 등 처벌법규에 해당하는 사실에 대하여 일시, 장소, 범행방법, 결과 등을 구체적으로 특정하여 기재해야 하며, 고소인이 알고 있는 지식과 경험, 증거에 의해 사실로 인정되는 내용을 기재하여야 합니다.</w:t>
+      </w:r>
+    </w:p>
+    <w:p>
+      <w:pPr>
+        <w:rPr>
+          <w:rFonts w:ascii="Batang" w:hAnsi="Batang" w:eastAsia="Batang" w:cs="Batang"/>
         </w:rPr>
       </w:pPr>
     </w:p>
     <w:p>
       <w:pPr>
         <w:pStyle w:val="a3"/>
-        <w:spacing w:before="100" w:line="360" w:lineRule="auto"/>
+        <w:spacing w:after="140" w:line="360" w:lineRule="auto"/>
+        <w:rPr>
+          <w:rFonts w:ascii="Batang" w:hAnsi="Batang" w:eastAsia="Batang" w:cs="Batang"/>
+          <w:b w:val="1"/>
+          <w:bCs w:val="1"/>
+          <w:sz w:val="30"/>
+          <w:szCs w:val="30"/>
+          <w:vertAlign w:val="superscript"/>
+        </w:rPr>
+      </w:pPr>
+      <w:r>
+        <w:rPr>
+          <w:rFonts w:ascii="Batang" w:hAnsi="Batang" w:eastAsia="Batang" w:cs="Batang"/>
+          <w:b w:val="1"/>
+          <w:bCs w:val="1"/>
+          <w:sz w:val="30"/>
+          <w:szCs w:val="30"/>
+        </w:rPr>
+        <w:t xml:space="preserve">5. </w:t>
+      </w:r>
+      <w:r>
+        <w:rPr>
+          <w:rFonts w:ascii="Batang" w:hAnsi="Batang" w:eastAsia="Batang" w:cs="Batang"/>
+          <w:b w:val="1"/>
+          <w:bCs w:val="1"/>
+          <w:sz w:val="30"/>
+          <w:szCs w:val="30"/>
+        </w:rPr>
+        <w:t>고소이유</w:t>
+      </w:r>
+    </w:p>
+    <w:p>
+      <w:pPr>
+        <w:pStyle w:val="a3"/>
+        <w:rPr>
+          <w:rFonts w:ascii="Batang" w:hAnsi="Batang" w:eastAsia="Batang" w:cs="Batang"/>
+          <w:sz w:val="24"/>
+          <w:szCs w:val="24"/>
+        </w:rPr>
+      </w:pPr>
+      <w:r>
+        <w:rPr>
+          <w:rFonts w:ascii="Batang" w:hAnsi="Batang" w:eastAsia="Batang" w:cs="Batang"/>
+          <w:sz w:val="24"/>
+          <w:szCs w:val="24"/>
+        </w:rPr>
+        <w:t>{{ s</w:t>
+      </w:r>
+      <w:r>
+        <w:rPr>
+          <w:rFonts w:ascii="Batang" w:hAnsi="Batang" w:eastAsia="Batang" w:cs="Batang"/>
+          <w:sz w:val="24"/>
+          <w:szCs w:val="24"/>
+        </w:rPr>
+        <w:t>5_complaint_</w:t>
+      </w:r>
+      <w:r>
+        <w:rPr>
+          <w:rFonts w:ascii="Batang" w:hAnsi="Batang" w:eastAsia="Batang" w:cs="Batang"/>
+          <w:sz w:val="24"/>
+          <w:szCs w:val="24"/>
+        </w:rPr>
+        <w:t>reason }</w:t>
+      </w:r>
+      <w:r>
+        <w:rPr>
+          <w:rFonts w:ascii="Batang" w:hAnsi="Batang" w:eastAsia="Batang" w:cs="Batang"/>
+          <w:sz w:val="24"/>
+          <w:szCs w:val="24"/>
+        </w:rPr>
+        <w:t>}</w:t>
+      </w:r>
+    </w:p>
+    <w:p>
+      <w:pPr>
+        <w:pStyle w:val="a3"/>
+        <w:rPr>
+          <w:rFonts w:ascii="Batang" w:hAnsi="Batang" w:eastAsia="Batang" w:cs="Batang"/>
+          <w:sz w:val="24"/>
+          <w:szCs w:val="24"/>
+        </w:rPr>
+      </w:pPr>
+    </w:p>
+    <w:p>
+      <w:pPr>
+        <w:pStyle w:val="a3"/>
+        <w:spacing w:before="100" w:line="276" w:lineRule="auto"/>
         <w:ind w:left="556" w:right="300" w:hanging="556"/>
         <w:rPr>
           <w:rFonts w:ascii="Batang" w:hAnsi="Batang" w:eastAsia="Batang" w:cs="Batang"/>
@@ -3874,7 +4110,7 @@
           <w:sz w:val="22"/>
           <w:szCs w:val="22"/>
         </w:rPr>
-        <w:t>※ 범죄사실은 형법 등 처벌법규에 해당하는 사실에 대하여 일시, 장소, 범행방법, 결과 등을 구체적으로 특정하여 기재해야 하며, 고소인이 알고 있는 지식과 경험, 증거에 의해 사실로 인정되는 내용을 기재하여야 합니다.</w:t>
+        <w:t>※ 고소이유에는 피고소인의 범행 경위 및 정황, 고소를 하게 된 동기와 사유 등 범죄사실을 뒷받침하는 내용을 간략, 명료하게 기재해야 합니다.</w:t>
       </w:r>
     </w:p>
     <w:p>
@@ -3915,7 +4151,7 @@
           <w:sz w:val="30"/>
           <w:szCs w:val="30"/>
         </w:rPr>
-        <w:t>5</w:t>
+        <w:t xml:space="preserve">6</w:t>
       </w:r>
       <w:r>
         <w:rPr>
@@ -3941,79 +4177,8 @@
         </w:rPr>
         <w:t>증거자료</w:t>
       </w:r>
-    </w:p>
-    <w:p>
-      <w:pPr>
-        <w:spacing w:after="0" w:line="432" w:lineRule="auto"/>
-        <w:textAlignment w:val="baseline"/>
-        <w:rPr>
-          <w:rFonts w:ascii="Batang" w:hAnsi="Batang" w:eastAsia="Batang" w:cs="Batang"/>
-          <w:color w:val="000000"/>
-          <w:kern w:val="0"/>
-          <w:sz w:val="18"/>
-          <w:szCs w:val="18"/>
-        </w:rPr>
-      </w:pPr>
-      <w:r>
-        <w:rPr>
-          <w:rFonts w:ascii="Batang" w:hAnsi="Batang" w:eastAsia="Batang" w:cs="Batang"/>
-          <w:color w:val="000000"/>
-          <w:kern w:val="0"/>
-          <w:sz w:val="18"/>
-          <w:szCs w:val="18"/>
-        </w:rPr>
-        <w:t>(</w:t>
-      </w:r>
-      <w:r>
-        <w:rPr>
-          <w:rFonts w:ascii="Batang" w:hAnsi="Batang" w:eastAsia="Batang" w:cs="Batang"/>
-          <w:color w:val="000000"/>
-          <w:kern w:val="0"/>
-          <w:sz w:val="18"/>
-          <w:szCs w:val="18"/>
-        </w:rPr>
-        <w:t>✓</w:t>
-      </w:r>
-      <w:r>
-        <w:rPr>
-          <w:rFonts w:ascii="Batang" w:hAnsi="Batang" w:eastAsia="Batang" w:cs="Batang"/>
-          <w:color w:val="000000"/>
-          <w:kern w:val="0"/>
-          <w:sz w:val="18"/>
-          <w:szCs w:val="18"/>
-        </w:rPr>
-        <w:t xml:space="preserve"> </w:t>
-      </w:r>
-      <w:r>
-        <w:rPr>
-          <w:rFonts w:ascii="Batang" w:hAnsi="Batang" w:eastAsia="Batang" w:cs="Batang"/>
-          <w:color w:val="000000"/>
-          <w:kern w:val="0"/>
-          <w:sz w:val="18"/>
-          <w:szCs w:val="18"/>
-        </w:rPr>
-        <w:t>해당란에</w:t>
-      </w:r>
-      <w:r>
-        <w:rPr>
-          <w:rFonts w:ascii="Batang" w:hAnsi="Batang" w:eastAsia="Batang" w:cs="Batang"/>
-          <w:color w:val="000000"/>
-          <w:kern w:val="0"/>
-          <w:sz w:val="18"/>
-          <w:szCs w:val="18"/>
-        </w:rPr>
-        <w:t xml:space="preserve"> 체크하여 주시기 바랍니다</w:t>
-      </w:r>
-      <w:r>
-        <w:rPr>
-          <w:rFonts w:ascii="Batang" w:hAnsi="Batang" w:eastAsia="Batang" w:cs="Batang"/>
-          <w:color w:val="000000"/>
-          <w:kern w:val="0"/>
-          <w:sz w:val="18"/>
-          <w:szCs w:val="18"/>
-        </w:rPr>
-        <w:t>)</w:t>
-      </w:r>
+      <w:proofErr w:type="spellStart"/>
+      <w:proofErr w:type="spellEnd"/>
     </w:p>
     <w:p>
       <w:pPr>
@@ -4038,7 +4203,84 @@
           <w:sz w:val="30"/>
           <w:szCs w:val="30"/>
         </w:rPr>
-        <w:t xml:space="preserve">□ </w:t>
+        <w:t xml:space="preserve">{{ </w:t>
+      </w:r>
+      <w:r>
+        <w:rPr>
+          <w:rFonts w:ascii="Batang" w:hAnsi="Batang" w:eastAsia="Batang" w:cs="Batang"/>
+          <w:color w:val="000000"/>
+          <w:spacing w:val="-4"/>
+          <w:kern w:val="0"/>
+          <w:sz w:val="30"/>
+          <w:szCs w:val="30"/>
+        </w:rPr>
+        <w:t xml:space="preserve">s</w:t>
+      </w:r>
+      <w:r>
+        <w:rPr>
+          <w:rFonts w:ascii="Batang" w:hAnsi="Batang" w:eastAsia="Batang" w:cs="Batang"/>
+          <w:color w:val="000000"/>
+          <w:spacing w:val="-4"/>
+          <w:kern w:val="0"/>
+          <w:sz w:val="30"/>
+          <w:szCs w:val="30"/>
+        </w:rPr>
+        <w:t xml:space="preserve">6_</w:t>
+      </w:r>
+      <w:r>
+        <w:rPr>
+          <w:rFonts w:ascii="Batang" w:hAnsi="Batang" w:eastAsia="Batang" w:cs="Batang"/>
+          <w:color w:val="000000"/>
+          <w:spacing w:val="-4"/>
+          <w:kern w:val="0"/>
+          <w:sz w:val="30"/>
+          <w:szCs w:val="30"/>
+        </w:rPr>
+        <w:t xml:space="preserve">no_</w:t>
+      </w:r>
+      <w:r>
+        <w:rPr>
+          <w:rFonts w:ascii="Batang" w:hAnsi="Batang" w:eastAsia="Batang" w:cs="Batang"/>
+          <w:color w:val="000000"/>
+          <w:spacing w:val="-4"/>
+          <w:kern w:val="0"/>
+          <w:sz w:val="30"/>
+          <w:szCs w:val="30"/>
+        </w:rPr>
+        <w:t xml:space="preserve">evidence</w:t>
+      </w:r>
+      <w:r>
+        <w:rPr>
+          <w:rFonts w:ascii="Batang" w:hAnsi="Batang" w:eastAsia="Batang" w:cs="Batang"/>
+          <w:color w:val="000000"/>
+          <w:spacing w:val="-4"/>
+          <w:kern w:val="0"/>
+          <w:sz w:val="30"/>
+          <w:szCs w:val="30"/>
+        </w:rPr>
+        <w:t xml:space="preserve"> }</w:t>
+      </w:r>
+      <w:r>
+        <w:rPr>
+          <w:rFonts w:ascii="Batang" w:hAnsi="Batang" w:eastAsia="Batang" w:cs="Batang"/>
+          <w:color w:val="000000"/>
+          <w:spacing w:val="-4"/>
+          <w:kern w:val="0"/>
+          <w:sz w:val="30"/>
+          <w:szCs w:val="30"/>
+        </w:rPr>
+        <w:t xml:space="preserve">}</w:t>
+      </w:r>
+      <w:r>
+        <w:rPr>
+          <w:rFonts w:ascii="Batang" w:hAnsi="Batang" w:eastAsia="Batang" w:cs="Batang"/>
+          <w:color w:val="000000"/>
+          <w:spacing w:val="-4"/>
+          <w:kern w:val="0"/>
+          <w:sz w:val="30"/>
+          <w:szCs w:val="30"/>
+        </w:rPr>
+        <w:t xml:space="preserve"> </w:t>
       </w:r>
       <w:r>
         <w:rPr>
@@ -4086,7 +4328,7 @@
           <w:sz w:val="30"/>
           <w:szCs w:val="30"/>
         </w:rPr>
-        <w:t>■</w:t>
+        <w:t xml:space="preserve">{{ </w:t>
       </w:r>
       <w:r>
         <w:rPr>
@@ -4097,7 +4339,7 @@
           <w:sz w:val="30"/>
           <w:szCs w:val="30"/>
         </w:rPr>
-        <w:t xml:space="preserve"> </w:t>
+        <w:t>s</w:t>
       </w:r>
       <w:r>
         <w:rPr>
@@ -4108,7 +4350,7 @@
           <w:sz w:val="30"/>
           <w:szCs w:val="30"/>
         </w:rPr>
-        <w:t>고소인은 고소인의 진술 외에 제출할 증거가 있습니다</w:t>
+        <w:t>6_</w:t>
       </w:r>
       <w:r>
         <w:rPr>
@@ -4119,8 +4361,215 @@
           <w:sz w:val="30"/>
           <w:szCs w:val="30"/>
         </w:rPr>
+        <w:t>has_</w:t>
+      </w:r>
+      <w:r>
+        <w:rPr>
+          <w:rFonts w:ascii="Batang" w:hAnsi="Batang" w:eastAsia="Batang" w:cs="Batang"/>
+          <w:color w:val="000000"/>
+          <w:spacing w:val="-4"/>
+          <w:kern w:val="0"/>
+          <w:sz w:val="30"/>
+          <w:szCs w:val="30"/>
+        </w:rPr>
+        <w:t>evidence }</w:t>
+      </w:r>
+      <w:r>
+        <w:rPr>
+          <w:rFonts w:ascii="Batang" w:hAnsi="Batang" w:eastAsia="Batang" w:cs="Batang"/>
+          <w:color w:val="000000"/>
+          <w:spacing w:val="-4"/>
+          <w:kern w:val="0"/>
+          <w:sz w:val="30"/>
+          <w:szCs w:val="30"/>
+        </w:rPr>
+        <w:t>}</w:t>
+      </w:r>
+      <w:r>
+        <w:rPr>
+          <w:rFonts w:ascii="Batang" w:hAnsi="Batang" w:eastAsia="Batang" w:cs="Batang"/>
+          <w:color w:val="000000"/>
+          <w:spacing w:val="-4"/>
+          <w:kern w:val="0"/>
+          <w:sz w:val="30"/>
+          <w:szCs w:val="30"/>
+        </w:rPr>
+        <w:t xml:space="preserve"> </w:t>
+      </w:r>
+      <w:r>
+        <w:rPr>
+          <w:rFonts w:ascii="Batang" w:hAnsi="Batang" w:eastAsia="Batang" w:cs="Batang"/>
+          <w:color w:val="000000"/>
+          <w:spacing w:val="-4"/>
+          <w:kern w:val="0"/>
+          <w:sz w:val="30"/>
+          <w:szCs w:val="30"/>
+        </w:rPr>
+        <w:t>고소인은 고소인의 진술 외에 제출할 증거가 있습니다</w:t>
+      </w:r>
+      <w:r>
+        <w:rPr>
+          <w:rFonts w:ascii="Batang" w:hAnsi="Batang" w:eastAsia="Batang" w:cs="Batang"/>
+          <w:color w:val="000000"/>
+          <w:spacing w:val="-4"/>
+          <w:kern w:val="0"/>
+          <w:sz w:val="30"/>
+          <w:szCs w:val="30"/>
+        </w:rPr>
         <w:t>.</w:t>
       </w:r>
+    </w:p>
+    <w:p>
+      <w:pPr>
+        <w:spacing w:before="60" w:after="0" w:line="432" w:lineRule="auto"/>
+        <w:ind w:left="736" w:hanging="736"/>
+        <w:rPr>
+          <w:rFonts w:ascii="Batang" w:hAnsi="Batang" w:eastAsia="Batang" w:cs="Batang"/>
+          <w:b w:val="1"/>
+          <w:bCs w:val="1"/>
+          <w:color w:val="000000" w:themeColor="text1" w:themeTint="FF" w:themeShade="FF"/>
+          <w:sz w:val="26"/>
+          <w:szCs w:val="26"/>
+        </w:rPr>
+      </w:pPr>
+      <w:r>
+        <w:rPr>
+          <w:rFonts w:ascii="Batang" w:hAnsi="Batang" w:eastAsia="Batang" w:cs="Batang"/>
+          <w:b w:val="1"/>
+          <w:bCs w:val="1"/>
+          <w:color w:val="000000" w:themeColor="text1" w:themeTint="FF" w:themeShade="FF"/>
+          <w:sz w:val="26"/>
+          <w:szCs w:val="26"/>
+        </w:rPr>
+        <w:t xml:space="preserve">제출 </w:t>
+      </w:r>
+      <w:r>
+        <w:rPr>
+          <w:rFonts w:ascii="Batang" w:hAnsi="Batang" w:eastAsia="Batang" w:cs="Batang"/>
+          <w:b w:val="1"/>
+          <w:bCs w:val="1"/>
+          <w:color w:val="000000" w:themeColor="text1" w:themeTint="FF" w:themeShade="FF"/>
+          <w:sz w:val="26"/>
+          <w:szCs w:val="26"/>
+        </w:rPr>
+        <w:t>예정</w:t>
+      </w:r>
+      <w:r>
+        <w:rPr>
+          <w:rFonts w:ascii="Batang" w:hAnsi="Batang" w:eastAsia="Batang" w:cs="Batang"/>
+          <w:b w:val="1"/>
+          <w:bCs w:val="1"/>
+          <w:color w:val="000000" w:themeColor="text1" w:themeTint="FF" w:themeShade="FF"/>
+          <w:sz w:val="26"/>
+          <w:szCs w:val="26"/>
+        </w:rPr>
+        <w:t xml:space="preserve"> </w:t>
+      </w:r>
+      <w:r>
+        <w:rPr>
+          <w:rFonts w:ascii="Batang" w:hAnsi="Batang" w:eastAsia="Batang" w:cs="Batang"/>
+          <w:b w:val="1"/>
+          <w:bCs w:val="1"/>
+          <w:color w:val="000000" w:themeColor="text1" w:themeTint="FF" w:themeShade="FF"/>
+          <w:sz w:val="26"/>
+          <w:szCs w:val="26"/>
+        </w:rPr>
+        <w:t>증거</w:t>
+      </w:r>
+      <w:r>
+        <w:rPr>
+          <w:rFonts w:ascii="Batang" w:hAnsi="Batang" w:eastAsia="Batang" w:cs="Batang"/>
+          <w:b w:val="1"/>
+          <w:bCs w:val="1"/>
+          <w:color w:val="000000" w:themeColor="text1" w:themeTint="FF" w:themeShade="FF"/>
+          <w:sz w:val="26"/>
+          <w:szCs w:val="26"/>
+        </w:rPr>
+        <w:t xml:space="preserve"> </w:t>
+      </w:r>
+      <w:r>
+        <w:rPr>
+          <w:rFonts w:ascii="Batang" w:hAnsi="Batang" w:eastAsia="Batang" w:cs="Batang"/>
+          <w:b w:val="1"/>
+          <w:bCs w:val="1"/>
+          <w:color w:val="000000" w:themeColor="text1" w:themeTint="FF" w:themeShade="FF"/>
+          <w:sz w:val="26"/>
+          <w:szCs w:val="26"/>
+        </w:rPr>
+        <w:t>목록</w:t>
+      </w:r>
+    </w:p>
+    <w:p>
+      <w:pPr>
+        <w:spacing w:before="60" w:after="0" w:line="432" w:lineRule="auto"/>
+        <w:ind w:left="736" w:hanging="736"/>
+        <w:rPr>
+          <w:rFonts w:ascii="Batang" w:hAnsi="Batang" w:eastAsia="Batang" w:cs="Batang"/>
+          <w:b w:val="0"/>
+          <w:bCs w:val="0"/>
+          <w:color w:val="000000" w:themeColor="text1" w:themeTint="FF" w:themeShade="FF"/>
+          <w:sz w:val="26"/>
+          <w:szCs w:val="26"/>
+        </w:rPr>
+      </w:pPr>
+      <w:r>
+        <w:rPr>
+          <w:rFonts w:ascii="Batang" w:hAnsi="Batang" w:eastAsia="Batang" w:cs="Batang"/>
+          <w:b w:val="0"/>
+          <w:bCs w:val="0"/>
+          <w:color w:val="000000" w:themeColor="text1" w:themeTint="FF" w:themeShade="FF"/>
+          <w:sz w:val="26"/>
+          <w:szCs w:val="26"/>
+        </w:rPr>
+        <w:t>{{ s</w:t>
+      </w:r>
+      <w:r>
+        <w:rPr>
+          <w:rFonts w:ascii="Batang" w:hAnsi="Batang" w:eastAsia="Batang" w:cs="Batang"/>
+          <w:b w:val="0"/>
+          <w:bCs w:val="0"/>
+          <w:color w:val="000000" w:themeColor="text1" w:themeTint="FF" w:themeShade="FF"/>
+          <w:sz w:val="26"/>
+          <w:szCs w:val="26"/>
+        </w:rPr>
+        <w:t>6_evidence_</w:t>
+      </w:r>
+      <w:r>
+        <w:rPr>
+          <w:rFonts w:ascii="Batang" w:hAnsi="Batang" w:eastAsia="Batang" w:cs="Batang"/>
+          <w:b w:val="0"/>
+          <w:bCs w:val="0"/>
+          <w:color w:val="000000" w:themeColor="text1" w:themeTint="FF" w:themeShade="FF"/>
+          <w:sz w:val="26"/>
+          <w:szCs w:val="26"/>
+        </w:rPr>
+        <w:t>list }</w:t>
+      </w:r>
+      <w:r>
+        <w:rPr>
+          <w:rFonts w:ascii="Batang" w:hAnsi="Batang" w:eastAsia="Batang" w:cs="Batang"/>
+          <w:b w:val="0"/>
+          <w:bCs w:val="0"/>
+          <w:color w:val="000000" w:themeColor="text1" w:themeTint="FF" w:themeShade="FF"/>
+          <w:sz w:val="26"/>
+          <w:szCs w:val="26"/>
+        </w:rPr>
+        <w:t>}</w:t>
+      </w:r>
+    </w:p>
+    <w:p>
+      <w:pPr>
+        <w:spacing w:before="60" w:after="0" w:line="432" w:lineRule="auto"/>
+        <w:ind w:left="736" w:hanging="736"/>
+        <w:rPr>
+          <w:rFonts w:ascii="Batang" w:hAnsi="Batang" w:eastAsia="Batang" w:cs="Batang"/>
+          <w:b w:val="1"/>
+          <w:bCs w:val="1"/>
+          <w:color w:val="000000" w:themeColor="text1" w:themeTint="FF" w:themeShade="FF"/>
+          <w:sz w:val="26"/>
+          <w:szCs w:val="26"/>
+        </w:rPr>
+      </w:pPr>
     </w:p>
     <w:p>
       <w:pPr>
@@ -4190,12 +4639,11 @@
     </w:p>
     <w:p>
       <w:pPr>
+        <w:pStyle w:val="a"/>
         <w:spacing w:after="0" w:line="432" w:lineRule="auto"/>
-        <w:textAlignment w:val="baseline"/>
-        <w:rPr>
-          <w:rFonts w:ascii="Batang" w:hAnsi="Batang" w:eastAsia="Batang" w:cs="Batang"/>
-          <w:color w:val="000000"/>
-          <w:kern w:val="0"/>
+        <w:rPr>
+          <w:rFonts w:ascii="Batang" w:hAnsi="Batang" w:eastAsia="Batang" w:cs="Batang"/>
+          <w:color w:val="000000" w:themeColor="text1" w:themeTint="FF" w:themeShade="FF"/>
           <w:sz w:val="30"/>
           <w:szCs w:val="30"/>
         </w:rPr>
@@ -4203,42 +4651,11 @@
     </w:p>
     <w:p>
       <w:pPr>
-        <w:widowControl w:val="1"/>
-        <w:wordWrap/>
-        <w:autoSpaceDE/>
-        <w:autoSpaceDN/>
-        <w:rPr>
-          <w:rFonts w:ascii="Batang" w:hAnsi="Batang" w:eastAsia="Batang" w:cs="Batang"/>
-          <w:b w:val="1"/>
-          <w:bCs w:val="1"/>
-          <w:color w:val="000000"/>
-          <w:kern w:val="0"/>
-          <w:sz w:val="30"/>
-          <w:szCs w:val="30"/>
-        </w:rPr>
-      </w:pPr>
-      <w:r>
-        <w:rPr>
-          <w:rFonts w:ascii="Batang" w:hAnsi="Batang" w:eastAsia="Batang" w:cs="Batang"/>
-          <w:b w:val="1"/>
-          <w:bCs w:val="1"/>
+        <w:pStyle w:val="a"/>
+        <w:spacing w:after="0" w:line="432" w:lineRule="auto"/>
+        <w:rPr>
+          <w:rFonts w:ascii="Batang" w:hAnsi="Batang" w:eastAsia="Batang" w:cs="Batang"/>
           <w:color w:val="000000" w:themeColor="text1" w:themeTint="FF" w:themeShade="FF"/>
-          <w:sz w:val="30"/>
-          <w:szCs w:val="30"/>
-        </w:rPr>
-        <w:br w:type="page"/>
-      </w:r>
-    </w:p>
-    <w:p>
-      <w:pPr>
-        <w:spacing w:after="140" w:line="432" w:lineRule="auto"/>
-        <w:textAlignment w:val="baseline"/>
-        <w:rPr>
-          <w:rFonts w:ascii="Batang" w:hAnsi="Batang" w:eastAsia="Batang" w:cs="Batang"/>
-          <w:b w:val="1"/>
-          <w:bCs w:val="1"/>
-          <w:color w:val="000000"/>
-          <w:kern w:val="0"/>
           <w:sz w:val="30"/>
           <w:szCs w:val="30"/>
         </w:rPr>
@@ -4246,6 +4663,8 @@
     </w:p>
     <w:p>
       <w:pPr>
+        <w:pStyle w:val="a"/>
+        <w:widowControl w:val="1"/>
         <w:spacing w:after="140" w:line="432" w:lineRule="auto"/>
         <w:textAlignment w:val="baseline"/>
         <w:rPr>
@@ -4258,11 +4677,7 @@
           <w:szCs w:val="30"/>
         </w:rPr>
       </w:pPr>
-    </w:p>
-    <w:p>
-      <w:pPr>
-        <w:spacing w:after="140" w:line="432" w:lineRule="auto"/>
-        <w:textAlignment w:val="baseline"/>
+      <w:r>
         <w:rPr>
           <w:rFonts w:ascii="Batang" w:hAnsi="Batang" w:eastAsia="Batang" w:cs="Batang"/>
           <w:b w:val="1"/>
@@ -4272,7 +4687,8 @@
           <w:sz w:val="30"/>
           <w:szCs w:val="30"/>
         </w:rPr>
-      </w:pPr>
+        <w:t xml:space="preserve">7</w:t>
+      </w:r>
       <w:r>
         <w:rPr>
           <w:rFonts w:ascii="Batang" w:hAnsi="Batang" w:eastAsia="Batang" w:cs="Batang"/>
@@ -4283,7 +4699,7 @@
           <w:sz w:val="30"/>
           <w:szCs w:val="30"/>
         </w:rPr>
-        <w:t>6</w:t>
+        <w:t xml:space="preserve">. </w:t>
       </w:r>
       <w:r>
         <w:rPr>
@@ -4295,7 +4711,7 @@
           <w:sz w:val="30"/>
           <w:szCs w:val="30"/>
         </w:rPr>
-        <w:t xml:space="preserve">. </w:t>
+        <w:t>관련사건의 수사 및 재판 여부</w:t>
       </w:r>
       <w:r>
         <w:rPr>
@@ -4306,99 +4722,15 @@
           <w:kern w:val="0"/>
           <w:sz w:val="30"/>
           <w:szCs w:val="30"/>
-        </w:rPr>
-        <w:t>관련사건의 수사 및 재판 여부</w:t>
-      </w:r>
-      <w:r>
-        <w:rPr>
-          <w:rFonts w:ascii="Batang" w:hAnsi="Batang" w:eastAsia="Batang" w:cs="Batang"/>
-          <w:b w:val="1"/>
-          <w:bCs w:val="1"/>
-          <w:color w:val="000000"/>
-          <w:kern w:val="0"/>
-          <w:sz w:val="30"/>
-          <w:szCs w:val="30"/>
+          <w:vertAlign w:val="superscript"/>
         </w:rPr>
         <w:t>*</w:t>
-      </w:r>
-    </w:p>
-    <w:p>
-      <w:pPr>
-        <w:spacing w:after="0" w:line="432" w:lineRule="auto"/>
-        <w:textAlignment w:val="baseline"/>
-        <w:rPr>
-          <w:rFonts w:ascii="Batang" w:hAnsi="Batang" w:eastAsia="Batang" w:cs="Batang"/>
-          <w:color w:val="000000"/>
-          <w:kern w:val="0"/>
-          <w:sz w:val="18"/>
-          <w:szCs w:val="18"/>
-        </w:rPr>
-      </w:pPr>
-      <w:r>
-        <w:rPr>
-          <w:rFonts w:ascii="Batang" w:hAnsi="Batang" w:eastAsia="Batang" w:cs="Batang"/>
-          <w:color w:val="000000"/>
-          <w:kern w:val="0"/>
-          <w:sz w:val="18"/>
-          <w:szCs w:val="18"/>
-        </w:rPr>
-        <w:t>(</w:t>
-      </w:r>
-      <w:r>
-        <w:rPr>
-          <w:rFonts w:ascii="Batang" w:hAnsi="Batang" w:eastAsia="Batang" w:cs="Batang"/>
-          <w:color w:val="000000"/>
-          <w:kern w:val="0"/>
-          <w:sz w:val="18"/>
-          <w:szCs w:val="18"/>
-        </w:rPr>
-        <w:t>✓</w:t>
-      </w:r>
-      <w:r>
-        <w:rPr>
-          <w:rFonts w:ascii="Batang" w:hAnsi="Batang" w:eastAsia="Batang" w:cs="Batang"/>
-          <w:color w:val="000000"/>
-          <w:kern w:val="0"/>
-          <w:sz w:val="18"/>
-          <w:szCs w:val="18"/>
-        </w:rPr>
-        <w:t xml:space="preserve"> </w:t>
-      </w:r>
-      <w:r>
-        <w:rPr>
-          <w:rFonts w:ascii="Batang" w:hAnsi="Batang" w:eastAsia="Batang" w:cs="Batang"/>
-          <w:color w:val="000000"/>
-          <w:kern w:val="0"/>
-          <w:sz w:val="18"/>
-          <w:szCs w:val="18"/>
-        </w:rPr>
-        <w:t>해당란에</w:t>
-      </w:r>
-      <w:r>
-        <w:rPr>
-          <w:rFonts w:ascii="Batang" w:hAnsi="Batang" w:eastAsia="Batang" w:cs="Batang"/>
-          <w:color w:val="000000"/>
-          <w:kern w:val="0"/>
-          <w:sz w:val="18"/>
-          <w:szCs w:val="18"/>
-        </w:rPr>
-        <w:t xml:space="preserve"> 체크하여 주시기 바랍니다</w:t>
-      </w:r>
-      <w:r>
-        <w:rPr>
-          <w:rFonts w:ascii="Batang" w:hAnsi="Batang" w:eastAsia="Batang" w:cs="Batang"/>
-          <w:color w:val="000000"/>
-          <w:kern w:val="0"/>
-          <w:sz w:val="18"/>
-          <w:szCs w:val="18"/>
-        </w:rPr>
-        <w:t>)</w:t>
       </w:r>
     </w:p>
     <w:tbl>
       <w:tblPr>
         <w:tblOverlap w:val="never"/>
-        <w:tblW w:w="0" w:type="auto"/>
+        <w:tblW w:w="10565" w:type="dxa"/>
         <w:tblCellMar>
           <w:top w:w="15" w:type="dxa"/>
           <w:left w:w="15" w:type="dxa"/>
@@ -4408,8 +4740,8 @@
         <w:tblLook w:val="04A0" w:firstRow="1" w:lastRow="0" w:firstColumn="1" w:lastColumn="0" w:noHBand="0" w:noVBand="1"/>
       </w:tblPr>
       <w:tblGrid>
-        <w:gridCol w:w="2248"/>
-        <w:gridCol w:w="6914"/>
+        <w:gridCol w:w="2225"/>
+        <w:gridCol w:w="8340"/>
       </w:tblGrid>
       <w:tr>
         <w:trPr>
@@ -4417,7 +4749,7 @@
         </w:trPr>
         <w:tc>
           <w:tcPr>
-            <w:tcW w:w="2248" w:type="dxa"/>
+            <w:tcW w:w="2225" w:type="dxa"/>
             <w:tcBorders>
               <w:top w:val="single" w:color="000000" w:themeColor="text1" w:sz="12" w:space="0"/>
               <w:left w:val="single" w:color="000000" w:themeColor="text1" w:sz="12" w:space="0"/>
@@ -4435,11 +4767,7 @@
           </w:tcPr>
           <w:p>
             <w:pPr>
-              <w:pStyle w:val="a4"/>
-              <w:numPr>
-                <w:ilvl w:val="0"/>
-                <w:numId w:val="1"/>
-              </w:numPr>
+              <w:pStyle w:val="a"/>
               <w:wordWrap/>
               <w:spacing w:after="0" w:line="384" w:lineRule="auto"/>
               <w:ind w:leftChars="0" w:right="60"/>
@@ -4456,6 +4784,24 @@
             <w:r>
               <w:rPr>
                 <w:rFonts w:ascii="Batang" w:hAnsi="Batang" w:eastAsia="Batang" w:cs="Batang"/>
+                <w:color w:val="000000" w:themeColor="text1" w:themeTint="FF" w:themeShade="FF"/>
+                <w:sz w:val="22"/>
+                <w:szCs w:val="22"/>
+              </w:rPr>
+              <w:t xml:space="preserve"> </w:t>
+            </w:r>
+            <w:r>
+              <w:rPr>
+                <w:rFonts w:ascii="Batang" w:hAnsi="Batang" w:eastAsia="Batang" w:cs="Batang"/>
+                <w:color w:val="000000" w:themeColor="text1" w:themeTint="FF" w:themeShade="FF"/>
+                <w:sz w:val="22"/>
+                <w:szCs w:val="22"/>
+              </w:rPr>
+              <w:t xml:space="preserve">① </w:t>
+            </w:r>
+            <w:r>
+              <w:rPr>
+                <w:rFonts w:ascii="Batang" w:hAnsi="Batang" w:eastAsia="Batang" w:cs="Batang"/>
                 <w:color w:val="000000"/>
                 <w:kern w:val="0"/>
                 <w:sz w:val="24"/>
@@ -4467,7 +4813,7 @@
         </w:tc>
         <w:tc>
           <w:tcPr>
-            <w:tcW w:w="6914" w:type="dxa"/>
+            <w:tcW w:w="8340" w:type="dxa"/>
             <w:tcBorders>
               <w:top w:val="single" w:color="000000" w:themeColor="text1" w:sz="12" w:space="0"/>
               <w:left w:val="single" w:color="000000" w:themeColor="text1" w:sz="2" w:space="0"/>
@@ -4485,6 +4831,7 @@
           </w:tcPr>
           <w:p>
             <w:pPr>
+              <w:pStyle w:val="a"/>
               <w:spacing w:after="0" w:line="312" w:lineRule="auto"/>
               <w:ind w:left="60" w:right="60"/>
               <w:textAlignment w:val="baseline"/>
@@ -4535,7 +4882,37 @@
                 <w:sz w:val="24"/>
                 <w:szCs w:val="24"/>
               </w:rPr>
-              <w:t>□</w:t>
+              <w:t xml:space="preserve">{{ s</w:t>
+            </w:r>
+            <w:r>
+              <w:rPr>
+                <w:rFonts w:ascii="Batang" w:hAnsi="Batang" w:eastAsia="Batang" w:cs="Batang"/>
+                <w:color w:val="000000"/>
+                <w:kern w:val="0"/>
+                <w:sz w:val="24"/>
+                <w:szCs w:val="24"/>
+              </w:rPr>
+              <w:t xml:space="preserve">7_1_</w:t>
+            </w:r>
+            <w:r>
+              <w:rPr>
+                <w:rFonts w:ascii="Batang" w:hAnsi="Batang" w:eastAsia="Batang" w:cs="Batang"/>
+                <w:color w:val="000000"/>
+                <w:kern w:val="0"/>
+                <w:sz w:val="24"/>
+                <w:szCs w:val="24"/>
+              </w:rPr>
+              <w:t xml:space="preserve">true }</w:t>
+            </w:r>
+            <w:r>
+              <w:rPr>
+                <w:rFonts w:ascii="Batang" w:hAnsi="Batang" w:eastAsia="Batang" w:cs="Batang"/>
+                <w:color w:val="000000"/>
+                <w:kern w:val="0"/>
+                <w:sz w:val="24"/>
+                <w:szCs w:val="24"/>
+              </w:rPr>
+              <w:t xml:space="preserve">}</w:t>
             </w:r>
             <w:r>
               <w:rPr>
@@ -4593,13 +4970,47 @@
             <w:r>
               <w:rPr>
                 <w:rFonts w:ascii="Batang" w:hAnsi="Batang" w:eastAsia="Batang" w:cs="Batang"/>
-                <w:color w:val="000000"/>
-                <w:spacing w:val="-4"/>
-                <w:kern w:val="0"/>
-                <w:sz w:val="24"/>
-                <w:szCs w:val="24"/>
-              </w:rPr>
-              <w:t>■</w:t>
+                <w:color w:val="000000" w:themeColor="text1" w:themeTint="FF" w:themeShade="FF"/>
+                <w:sz w:val="24"/>
+                <w:szCs w:val="24"/>
+              </w:rPr>
+              <w:t>{{ s</w:t>
+            </w:r>
+            <w:r>
+              <w:rPr>
+                <w:rFonts w:ascii="Batang" w:hAnsi="Batang" w:eastAsia="Batang" w:cs="Batang"/>
+                <w:color w:val="000000" w:themeColor="text1" w:themeTint="FF" w:themeShade="FF"/>
+                <w:sz w:val="24"/>
+                <w:szCs w:val="24"/>
+              </w:rPr>
+              <w:t>7_1_</w:t>
+            </w:r>
+            <w:r>
+              <w:rPr>
+                <w:rFonts w:ascii="Batang" w:hAnsi="Batang" w:eastAsia="Batang" w:cs="Batang"/>
+                <w:color w:val="000000" w:themeColor="text1" w:themeTint="FF" w:themeShade="FF"/>
+                <w:sz w:val="24"/>
+                <w:szCs w:val="24"/>
+              </w:rPr>
+              <w:t>false</w:t>
+            </w:r>
+            <w:r>
+              <w:rPr>
+                <w:rFonts w:ascii="Batang" w:hAnsi="Batang" w:eastAsia="Batang" w:cs="Batang"/>
+                <w:color w:val="000000" w:themeColor="text1" w:themeTint="FF" w:themeShade="FF"/>
+                <w:sz w:val="24"/>
+                <w:szCs w:val="24"/>
+              </w:rPr>
+              <w:t xml:space="preserve"> }</w:t>
+            </w:r>
+            <w:r>
+              <w:rPr>
+                <w:rFonts w:ascii="Batang" w:hAnsi="Batang" w:eastAsia="Batang" w:cs="Batang"/>
+                <w:color w:val="000000" w:themeColor="text1" w:themeTint="FF" w:themeShade="FF"/>
+                <w:sz w:val="24"/>
+                <w:szCs w:val="24"/>
+              </w:rPr>
+              <w:t>}</w:t>
             </w:r>
             <w:r>
               <w:rPr>
@@ -4631,7 +5042,7 @@
         </w:trPr>
         <w:tc>
           <w:tcPr>
-            <w:tcW w:w="2248" w:type="dxa"/>
+            <w:tcW w:w="2225" w:type="dxa"/>
             <w:tcBorders>
               <w:top w:val="single" w:color="000000" w:themeColor="text1" w:sz="12" w:space="0"/>
               <w:left w:val="single" w:color="000000" w:themeColor="text1" w:sz="12" w:space="0"/>
@@ -4649,14 +5060,10 @@
           </w:tcPr>
           <w:p>
             <w:pPr>
-              <w:pStyle w:val="a4"/>
-              <w:numPr>
-                <w:ilvl w:val="0"/>
-                <w:numId w:val="1"/>
-              </w:numPr>
+              <w:pStyle w:val="a"/>
               <w:wordWrap/>
               <w:spacing w:after="0" w:line="384" w:lineRule="auto"/>
-              <w:ind w:leftChars="0" w:right="60"/>
+              <w:ind w:left="0" w:right="60"/>
               <w:jc w:val="left"/>
               <w:textAlignment w:val="baseline"/>
               <w:rPr>
@@ -4667,6 +5074,24 @@
                 <w:szCs w:val="24"/>
               </w:rPr>
             </w:pPr>
+            <w:r>
+              <w:rPr>
+                <w:rFonts w:ascii="Batang" w:hAnsi="Batang" w:eastAsia="Batang" w:cs="Batang"/>
+                <w:color w:val="000000" w:themeColor="text1" w:themeTint="FF" w:themeShade="FF"/>
+                <w:sz w:val="22"/>
+                <w:szCs w:val="22"/>
+              </w:rPr>
+              <w:t xml:space="preserve"> </w:t>
+            </w:r>
+            <w:r>
+              <w:rPr>
+                <w:rFonts w:ascii="Batang" w:hAnsi="Batang" w:eastAsia="Batang" w:cs="Batang"/>
+                <w:color w:val="000000" w:themeColor="text1" w:themeTint="FF" w:themeShade="FF"/>
+                <w:sz w:val="22"/>
+                <w:szCs w:val="22"/>
+              </w:rPr>
+              <w:t xml:space="preserve">② </w:t>
+            </w:r>
             <w:r>
               <w:rPr>
                 <w:rFonts w:ascii="Batang" w:hAnsi="Batang" w:eastAsia="Batang" w:cs="Batang"/>
@@ -4701,13 +5126,43 @@
                 <w:sz w:val="24"/>
                 <w:szCs w:val="24"/>
               </w:rPr>
-              <w:t>수사 유무</w:t>
+              <w:t xml:space="preserve">   </w:t>
+            </w:r>
+            <w:r>
+              <w:rPr>
+                <w:rFonts w:ascii="Batang" w:hAnsi="Batang" w:eastAsia="Batang" w:cs="Batang"/>
+                <w:color w:val="000000"/>
+                <w:kern w:val="0"/>
+                <w:sz w:val="24"/>
+                <w:szCs w:val="24"/>
+              </w:rPr>
+              <w:t xml:space="preserve">수사 </w:t>
+            </w:r>
+            <w:r>
+              <w:rPr>
+                <w:rFonts w:ascii="Batang" w:hAnsi="Batang" w:eastAsia="Batang" w:cs="Batang"/>
+                <w:color w:val="000000"/>
+                <w:kern w:val="0"/>
+                <w:sz w:val="24"/>
+                <w:szCs w:val="24"/>
+              </w:rPr>
+              <w:t xml:space="preserve">   </w:t>
+            </w:r>
+            <w:r>
+              <w:rPr>
+                <w:rFonts w:ascii="Batang" w:hAnsi="Batang" w:eastAsia="Batang" w:cs="Batang"/>
+                <w:color w:val="000000"/>
+                <w:kern w:val="0"/>
+                <w:sz w:val="24"/>
+                <w:szCs w:val="24"/>
+              </w:rPr>
+              <w:t>유무</w:t>
             </w:r>
           </w:p>
         </w:tc>
         <w:tc>
           <w:tcPr>
-            <w:tcW w:w="6914" w:type="dxa"/>
+            <w:tcW w:w="8340" w:type="dxa"/>
             <w:tcBorders>
               <w:top w:val="single" w:color="000000" w:themeColor="text1" w:sz="12" w:space="0"/>
               <w:left w:val="single" w:color="000000" w:themeColor="text1" w:sz="2" w:space="0"/>
@@ -4725,6 +5180,7 @@
           </w:tcPr>
           <w:p>
             <w:pPr>
+              <w:pStyle w:val="a"/>
               <w:spacing w:after="0" w:line="312" w:lineRule="auto"/>
               <w:ind w:left="60" w:right="60"/>
               <w:textAlignment w:val="baseline"/>
@@ -4749,12 +5205,38 @@
             <w:r>
               <w:rPr>
                 <w:rFonts w:ascii="Batang" w:hAnsi="Batang" w:eastAsia="Batang" w:cs="Batang"/>
-                <w:color w:val="000000"/>
-                <w:kern w:val="0"/>
-                <w:sz w:val="24"/>
-                <w:szCs w:val="24"/>
-              </w:rPr>
-              <w:t>□</w:t>
+                <w:color w:val="000000" w:themeColor="text1" w:themeTint="FF" w:themeShade="FF"/>
+                <w:sz w:val="24"/>
+                <w:szCs w:val="24"/>
+              </w:rPr>
+              <w:t>{{ s</w:t>
+            </w:r>
+            <w:r>
+              <w:rPr>
+                <w:rFonts w:ascii="Batang" w:hAnsi="Batang" w:eastAsia="Batang" w:cs="Batang"/>
+                <w:color w:val="000000" w:themeColor="text1" w:themeTint="FF" w:themeShade="FF"/>
+                <w:sz w:val="24"/>
+                <w:szCs w:val="24"/>
+              </w:rPr>
+              <w:t>7_2_</w:t>
+            </w:r>
+            <w:r>
+              <w:rPr>
+                <w:rFonts w:ascii="Batang" w:hAnsi="Batang" w:eastAsia="Batang" w:cs="Batang"/>
+                <w:color w:val="000000" w:themeColor="text1" w:themeTint="FF" w:themeShade="FF"/>
+                <w:sz w:val="24"/>
+                <w:szCs w:val="24"/>
+              </w:rPr>
+              <w:t>true }</w:t>
+            </w:r>
+            <w:r>
+              <w:rPr>
+                <w:rFonts w:ascii="Batang" w:hAnsi="Batang" w:eastAsia="Batang" w:cs="Batang"/>
+                <w:color w:val="000000" w:themeColor="text1" w:themeTint="FF" w:themeShade="FF"/>
+                <w:sz w:val="24"/>
+                <w:szCs w:val="24"/>
+              </w:rPr>
+              <w:t>}</w:t>
             </w:r>
             <w:r>
               <w:rPr>
@@ -4796,35 +5278,57 @@
               </w:rPr>
               <w:t>/</w:t>
             </w:r>
-          </w:p>
-          <w:p>
-            <w:pPr>
-              <w:spacing w:after="0" w:line="312" w:lineRule="auto"/>
-              <w:ind w:left="60" w:right="60"/>
-              <w:textAlignment w:val="baseline"/>
-              <w:rPr>
-                <w:rFonts w:ascii="Batang" w:hAnsi="Batang" w:eastAsia="Batang" w:cs="Batang"/>
-                <w:color w:val="000000"/>
-                <w:kern w:val="0"/>
-                <w:sz w:val="24"/>
-                <w:szCs w:val="24"/>
-              </w:rPr>
-            </w:pPr>
+            <w:r>
+              <w:rPr>
+                <w:rFonts w:ascii="Batang" w:hAnsi="Batang" w:eastAsia="Batang" w:cs="Batang"/>
+                <w:color w:val="000000"/>
+                <w:kern w:val="0"/>
+                <w:sz w:val="24"/>
+                <w:szCs w:val="24"/>
+              </w:rPr>
+              <w:t xml:space="preserve"> </w:t>
+            </w:r>
+            <w:r>
+              <w:rPr>
+                <w:rFonts w:ascii="Batang" w:hAnsi="Batang" w:eastAsia="Batang" w:cs="Batang"/>
+                <w:color w:val="000000" w:themeColor="text1" w:themeTint="FF" w:themeShade="FF"/>
+                <w:sz w:val="24"/>
+                <w:szCs w:val="24"/>
+              </w:rPr>
+              <w:t>{{ s</w:t>
+            </w:r>
+            <w:r>
+              <w:rPr>
+                <w:rFonts w:ascii="Batang" w:hAnsi="Batang" w:eastAsia="Batang" w:cs="Batang"/>
+                <w:color w:val="000000" w:themeColor="text1" w:themeTint="FF" w:themeShade="FF"/>
+                <w:sz w:val="24"/>
+                <w:szCs w:val="24"/>
+              </w:rPr>
+              <w:t>7_2_</w:t>
+            </w:r>
+            <w:r>
+              <w:rPr>
+                <w:rFonts w:ascii="Batang" w:hAnsi="Batang" w:eastAsia="Batang" w:cs="Batang"/>
+                <w:color w:val="000000" w:themeColor="text1" w:themeTint="FF" w:themeShade="FF"/>
+                <w:sz w:val="24"/>
+                <w:szCs w:val="24"/>
+              </w:rPr>
+              <w:t>false }</w:t>
+            </w:r>
+            <w:r>
+              <w:rPr>
+                <w:rFonts w:ascii="Batang" w:hAnsi="Batang" w:eastAsia="Batang" w:cs="Batang"/>
+                <w:color w:val="000000" w:themeColor="text1" w:themeTint="FF" w:themeShade="FF"/>
+                <w:sz w:val="24"/>
+                <w:szCs w:val="24"/>
+              </w:rPr>
+              <w:t>}</w:t>
+            </w:r>
             <w:r>
               <w:rPr>
                 <w:rFonts w:ascii="Batang" w:hAnsi="Batang" w:eastAsia="Batang" w:cs="Batang"/>
                 <w:color w:val="000000"/>
                 <w:spacing w:val="-4"/>
-                <w:kern w:val="0"/>
-                <w:sz w:val="24"/>
-                <w:szCs w:val="24"/>
-              </w:rPr>
-              <w:t>■</w:t>
-            </w:r>
-            <w:r>
-              <w:rPr>
-                <w:rFonts w:ascii="Batang" w:hAnsi="Batang" w:eastAsia="Batang" w:cs="Batang"/>
-                <w:color w:val="000000"/>
                 <w:kern w:val="0"/>
                 <w:sz w:val="24"/>
                 <w:szCs w:val="24"/>
@@ -4850,7 +5354,7 @@
         </w:trPr>
         <w:tc>
           <w:tcPr>
-            <w:tcW w:w="2248" w:type="dxa"/>
+            <w:tcW w:w="2225" w:type="dxa"/>
             <w:tcBorders>
               <w:top w:val="single" w:color="000000" w:themeColor="text1" w:sz="12" w:space="0"/>
               <w:left w:val="single" w:color="000000" w:themeColor="text1" w:sz="12" w:space="0"/>
@@ -4868,14 +5372,10 @@
           </w:tcPr>
           <w:p>
             <w:pPr>
-              <w:pStyle w:val="a4"/>
-              <w:numPr>
-                <w:ilvl w:val="0"/>
-                <w:numId w:val="1"/>
-              </w:numPr>
+              <w:pStyle w:val="a"/>
               <w:wordWrap/>
               <w:spacing w:after="0" w:line="384" w:lineRule="auto"/>
-              <w:ind w:leftChars="0" w:right="60"/>
+              <w:ind w:left="60" w:right="60"/>
               <w:jc w:val="left"/>
               <w:textAlignment w:val="baseline"/>
               <w:rPr>
@@ -4886,6 +5386,22 @@
                 <w:szCs w:val="24"/>
               </w:rPr>
             </w:pPr>
+            <w:r>
+              <w:rPr>
+                <w:rFonts w:ascii="Batang" w:hAnsi="Batang" w:eastAsia="Batang" w:cs="Batang"/>
+                <w:noProof w:val="0"/>
+                <w:lang w:eastAsia="ko-KR"/>
+              </w:rPr>
+              <w:t>③</w:t>
+            </w:r>
+            <w:r>
+              <w:rPr>
+                <w:rFonts w:ascii="Batang" w:hAnsi="Batang" w:eastAsia="Batang" w:cs="Batang"/>
+                <w:noProof w:val="0"/>
+                <w:lang w:eastAsia="ko-KR"/>
+              </w:rPr>
+              <w:t xml:space="preserve"> </w:t>
+            </w:r>
             <w:r>
               <w:rPr>
                 <w:rFonts w:ascii="Batang" w:hAnsi="Batang" w:eastAsia="Batang" w:cs="Batang"/>
@@ -4920,13 +5436,83 @@
                 <w:sz w:val="24"/>
                 <w:szCs w:val="24"/>
               </w:rPr>
-              <w:t>유 무</w:t>
+              <w:t xml:space="preserve">   </w:t>
+            </w:r>
+            <w:r>
+              <w:rPr>
+                <w:rFonts w:ascii="Batang" w:hAnsi="Batang" w:eastAsia="Batang" w:cs="Batang"/>
+                <w:color w:val="000000"/>
+                <w:kern w:val="0"/>
+                <w:sz w:val="24"/>
+                <w:szCs w:val="24"/>
+              </w:rPr>
+              <w:t xml:space="preserve"> </w:t>
+            </w:r>
+            <w:r>
+              <w:rPr>
+                <w:rFonts w:ascii="Batang" w:hAnsi="Batang" w:eastAsia="Batang" w:cs="Batang"/>
+                <w:color w:val="000000"/>
+                <w:kern w:val="0"/>
+                <w:sz w:val="24"/>
+                <w:szCs w:val="24"/>
+              </w:rPr>
+              <w:t xml:space="preserve"> </w:t>
+            </w:r>
+            <w:r>
+              <w:rPr>
+                <w:rFonts w:ascii="Batang" w:hAnsi="Batang" w:eastAsia="Batang" w:cs="Batang"/>
+                <w:color w:val="000000"/>
+                <w:kern w:val="0"/>
+                <w:sz w:val="24"/>
+                <w:szCs w:val="24"/>
+              </w:rPr>
+              <w:t>유</w:t>
+            </w:r>
+            <w:r>
+              <w:rPr>
+                <w:rFonts w:ascii="Batang" w:hAnsi="Batang" w:eastAsia="Batang" w:cs="Batang"/>
+                <w:color w:val="000000"/>
+                <w:kern w:val="0"/>
+                <w:sz w:val="24"/>
+                <w:szCs w:val="24"/>
+              </w:rPr>
+              <w:t xml:space="preserve"> </w:t>
+            </w:r>
+            <w:r>
+              <w:rPr>
+                <w:rFonts w:ascii="Batang" w:hAnsi="Batang" w:eastAsia="Batang" w:cs="Batang"/>
+                <w:color w:val="000000"/>
+                <w:kern w:val="0"/>
+                <w:sz w:val="24"/>
+                <w:szCs w:val="24"/>
+              </w:rPr>
+              <w:t xml:space="preserve">      </w:t>
+            </w:r>
+            <w:r>
+              <w:rPr>
+                <w:rFonts w:ascii="Batang" w:hAnsi="Batang" w:eastAsia="Batang" w:cs="Batang"/>
+                <w:color w:val="000000"/>
+                <w:kern w:val="0"/>
+                <w:sz w:val="24"/>
+                <w:szCs w:val="24"/>
+              </w:rPr>
+              <w:t xml:space="preserve"> </w:t>
+            </w:r>
+            <w:r>
+              <w:rPr>
+                <w:rFonts w:ascii="Batang" w:hAnsi="Batang" w:eastAsia="Batang" w:cs="Batang"/>
+                <w:color w:val="000000"/>
+                <w:kern w:val="0"/>
+                <w:sz w:val="24"/>
+                <w:szCs w:val="24"/>
+              </w:rPr>
+              <w:t>무</w:t>
             </w:r>
           </w:p>
         </w:tc>
         <w:tc>
           <w:tcPr>
-            <w:tcW w:w="6914" w:type="dxa"/>
+            <w:tcW w:w="8340" w:type="dxa"/>
             <w:tcBorders>
               <w:top w:val="single" w:color="000000" w:themeColor="text1" w:sz="12" w:space="0"/>
               <w:left w:val="single" w:color="000000" w:themeColor="text1" w:sz="2" w:space="0"/>
@@ -4944,6 +5530,7 @@
           </w:tcPr>
           <w:p>
             <w:pPr>
+              <w:pStyle w:val="a"/>
               <w:spacing w:after="0" w:line="312" w:lineRule="auto"/>
               <w:ind w:left="60" w:right="60"/>
               <w:textAlignment w:val="baseline"/>
@@ -4979,12 +5566,38 @@
             <w:r>
               <w:rPr>
                 <w:rFonts w:ascii="Batang" w:hAnsi="Batang" w:eastAsia="Batang" w:cs="Batang"/>
-                <w:color w:val="000000"/>
-                <w:kern w:val="0"/>
-                <w:sz w:val="24"/>
-                <w:szCs w:val="24"/>
-              </w:rPr>
-              <w:t>□</w:t>
+                <w:color w:val="000000" w:themeColor="text1" w:themeTint="FF" w:themeShade="FF"/>
+                <w:sz w:val="24"/>
+                <w:szCs w:val="24"/>
+              </w:rPr>
+              <w:t>{{ s</w:t>
+            </w:r>
+            <w:r>
+              <w:rPr>
+                <w:rFonts w:ascii="Batang" w:hAnsi="Batang" w:eastAsia="Batang" w:cs="Batang"/>
+                <w:color w:val="000000" w:themeColor="text1" w:themeTint="FF" w:themeShade="FF"/>
+                <w:sz w:val="24"/>
+                <w:szCs w:val="24"/>
+              </w:rPr>
+              <w:t>7_3_</w:t>
+            </w:r>
+            <w:r>
+              <w:rPr>
+                <w:rFonts w:ascii="Batang" w:hAnsi="Batang" w:eastAsia="Batang" w:cs="Batang"/>
+                <w:color w:val="000000" w:themeColor="text1" w:themeTint="FF" w:themeShade="FF"/>
+                <w:sz w:val="24"/>
+                <w:szCs w:val="24"/>
+              </w:rPr>
+              <w:t>true }</w:t>
+            </w:r>
+            <w:r>
+              <w:rPr>
+                <w:rFonts w:ascii="Batang" w:hAnsi="Batang" w:eastAsia="Batang" w:cs="Batang"/>
+                <w:color w:val="000000" w:themeColor="text1" w:themeTint="FF" w:themeShade="FF"/>
+                <w:sz w:val="24"/>
+                <w:szCs w:val="24"/>
+              </w:rPr>
+              <w:t>}</w:t>
             </w:r>
             <w:r>
               <w:rPr>
@@ -5029,18 +5642,53 @@
             <w:r>
               <w:rPr>
                 <w:rFonts w:ascii="Batang" w:hAnsi="Batang" w:eastAsia="Batang" w:cs="Batang"/>
+                <w:color w:val="000000" w:themeColor="text1" w:themeTint="FF" w:themeShade="FF"/>
+                <w:sz w:val="24"/>
+                <w:szCs w:val="24"/>
+              </w:rPr>
+              <w:t>{{ s</w:t>
+            </w:r>
+            <w:r>
+              <w:rPr>
+                <w:rFonts w:ascii="Batang" w:hAnsi="Batang" w:eastAsia="Batang" w:cs="Batang"/>
+                <w:color w:val="000000" w:themeColor="text1" w:themeTint="FF" w:themeShade="FF"/>
+                <w:sz w:val="24"/>
+                <w:szCs w:val="24"/>
+              </w:rPr>
+              <w:t>7_3_</w:t>
+            </w:r>
+            <w:r>
+              <w:rPr>
+                <w:rFonts w:ascii="Batang" w:hAnsi="Batang" w:eastAsia="Batang" w:cs="Batang"/>
+                <w:color w:val="000000" w:themeColor="text1" w:themeTint="FF" w:themeShade="FF"/>
+                <w:sz w:val="24"/>
+                <w:szCs w:val="24"/>
+              </w:rPr>
+              <w:t>false</w:t>
+            </w:r>
+            <w:r>
+              <w:rPr>
+                <w:rFonts w:ascii="Batang" w:hAnsi="Batang" w:eastAsia="Batang" w:cs="Batang"/>
+                <w:color w:val="000000" w:themeColor="text1" w:themeTint="FF" w:themeShade="FF"/>
+                <w:sz w:val="24"/>
+                <w:szCs w:val="24"/>
+              </w:rPr>
+              <w:t xml:space="preserve"> }</w:t>
+            </w:r>
+            <w:r>
+              <w:rPr>
+                <w:rFonts w:ascii="Batang" w:hAnsi="Batang" w:eastAsia="Batang" w:cs="Batang"/>
+                <w:color w:val="000000" w:themeColor="text1" w:themeTint="FF" w:themeShade="FF"/>
+                <w:sz w:val="24"/>
+                <w:szCs w:val="24"/>
+              </w:rPr>
+              <w:t>}</w:t>
+            </w:r>
+            <w:r>
+              <w:rPr>
+                <w:rFonts w:ascii="Batang" w:hAnsi="Batang" w:eastAsia="Batang" w:cs="Batang"/>
                 <w:color w:val="000000"/>
                 <w:spacing w:val="-4"/>
-                <w:kern w:val="0"/>
-                <w:sz w:val="24"/>
-                <w:szCs w:val="24"/>
-              </w:rPr>
-              <w:t>■</w:t>
-            </w:r>
-            <w:r>
-              <w:rPr>
-                <w:rFonts w:ascii="Batang" w:hAnsi="Batang" w:eastAsia="Batang" w:cs="Batang"/>
-                <w:color w:val="000000"/>
                 <w:kern w:val="0"/>
                 <w:sz w:val="24"/>
                 <w:szCs w:val="24"/>
@@ -5063,7 +5711,7 @@
     </w:tbl>
     <w:p>
       <w:pPr>
-        <w:spacing w:after="0" w:line="360" w:lineRule="auto"/>
+        <w:spacing w:before="100" w:beforeAutospacing="off" w:after="0" w:line="276" w:lineRule="auto"/>
         <w:ind w:left="540" w:right="300" w:hanging="540"/>
         <w:textAlignment w:val="baseline"/>
         <w:rPr>
@@ -5390,49 +6038,20 @@
     </w:p>
     <w:p>
       <w:pPr>
-        <w:widowControl w:val="1"/>
-        <w:wordWrap/>
-        <w:autoSpaceDE/>
-        <w:autoSpaceDN/>
-        <w:rPr>
-          <w:rFonts w:ascii="Batang" w:hAnsi="Batang" w:eastAsia="Batang" w:cs="Batang"/>
-          <w:b w:val="1"/>
-          <w:bCs w:val="1"/>
-          <w:color w:val="000000"/>
-          <w:kern w:val="0"/>
-          <w:sz w:val="30"/>
-          <w:szCs w:val="30"/>
-        </w:rPr>
-      </w:pPr>
-      <w:r>
-        <w:rPr>
-          <w:rFonts w:ascii="Batang" w:hAnsi="Batang" w:eastAsia="Batang" w:cs="Batang"/>
-          <w:b w:val="1"/>
-          <w:bCs w:val="1"/>
+        <w:spacing w:after="0" w:line="360" w:lineRule="auto"/>
+        <w:ind w:left="538" w:right="300" w:hanging="538"/>
+        <w:rPr>
+          <w:rFonts w:ascii="Batang" w:hAnsi="Batang" w:eastAsia="Batang" w:cs="Batang"/>
           <w:color w:val="000000" w:themeColor="text1" w:themeTint="FF" w:themeShade="FF"/>
-          <w:sz w:val="30"/>
-          <w:szCs w:val="30"/>
-        </w:rPr>
-        <w:br w:type="page"/>
-      </w:r>
-    </w:p>
-    <w:p>
-      <w:pPr>
-        <w:spacing w:after="140" w:line="432" w:lineRule="auto"/>
-        <w:textAlignment w:val="baseline"/>
-        <w:rPr>
-          <w:rFonts w:ascii="Batang" w:hAnsi="Batang" w:eastAsia="Batang" w:cs="Batang"/>
-          <w:b w:val="1"/>
-          <w:bCs w:val="1"/>
-          <w:color w:val="000000"/>
-          <w:kern w:val="0"/>
-          <w:sz w:val="30"/>
-          <w:szCs w:val="30"/>
+          <w:sz w:val="22"/>
+          <w:szCs w:val="22"/>
         </w:rPr>
       </w:pPr>
     </w:p>
     <w:p>
       <w:pPr>
+        <w:pStyle w:val="a"/>
+        <w:widowControl w:val="1"/>
         <w:spacing w:after="140" w:line="432" w:lineRule="auto"/>
         <w:textAlignment w:val="baseline"/>
         <w:rPr>
@@ -5455,7 +6074,7 @@
           <w:sz w:val="30"/>
           <w:szCs w:val="30"/>
         </w:rPr>
-        <w:t>7</w:t>
+        <w:t xml:space="preserve">8</w:t>
       </w:r>
       <w:r>
         <w:rPr>
@@ -5495,6 +6114,48 @@
     </w:p>
     <w:p>
       <w:pPr>
+        <w:pStyle w:val="a3"/>
+        <w:rPr>
+          <w:rFonts w:ascii="Batang" w:hAnsi="Batang" w:eastAsia="Batang" w:cs="Batang"/>
+          <w:sz w:val="24"/>
+          <w:szCs w:val="24"/>
+        </w:rPr>
+      </w:pPr>
+      <w:r>
+        <w:rPr>
+          <w:rFonts w:ascii="Batang" w:hAnsi="Batang" w:eastAsia="Batang" w:cs="Batang"/>
+          <w:sz w:val="24"/>
+          <w:szCs w:val="24"/>
+        </w:rPr>
+        <w:t>{{ s</w:t>
+      </w:r>
+      <w:r>
+        <w:rPr>
+          <w:rFonts w:ascii="Batang" w:hAnsi="Batang" w:eastAsia="Batang" w:cs="Batang"/>
+          <w:sz w:val="24"/>
+          <w:szCs w:val="24"/>
+        </w:rPr>
+        <w:t>8_other</w:t>
+      </w:r>
+      <w:r>
+        <w:rPr>
+          <w:rFonts w:ascii="Batang" w:hAnsi="Batang" w:eastAsia="Batang" w:cs="Batang"/>
+          <w:sz w:val="24"/>
+          <w:szCs w:val="24"/>
+        </w:rPr>
+        <w:t xml:space="preserve"> }</w:t>
+      </w:r>
+      <w:r>
+        <w:rPr>
+          <w:rFonts w:ascii="Batang" w:hAnsi="Batang" w:eastAsia="Batang" w:cs="Batang"/>
+          <w:sz w:val="24"/>
+          <w:szCs w:val="24"/>
+        </w:rPr>
+        <w:t>}</w:t>
+      </w:r>
+    </w:p>
+    <w:p>
+      <w:pPr>
         <w:rPr>
           <w:rFonts w:ascii="Batang" w:hAnsi="Batang" w:eastAsia="Batang" w:cs="Batang"/>
         </w:rPr>
@@ -5509,13 +6170,7 @@
     </w:p>
     <w:p>
       <w:pPr>
-        <w:rPr>
-          <w:rFonts w:ascii="Batang" w:hAnsi="Batang" w:eastAsia="Batang" w:cs="Batang"/>
-        </w:rPr>
-      </w:pPr>
-    </w:p>
-    <w:p>
-      <w:pPr>
+        <w:pStyle w:val="a"/>
         <w:rPr>
           <w:rFonts w:ascii="Batang" w:hAnsi="Batang" w:eastAsia="Batang" w:cs="Batang"/>
         </w:rPr>
@@ -5525,13 +6180,22 @@
       <w:pPr>
         <w:pStyle w:val="a3"/>
         <w:spacing w:line="432" w:lineRule="auto"/>
-        <w:ind w:left="140" w:hanging="140"/>
+        <w:ind w:left="0" w:hanging="0"/>
         <w:rPr>
           <w:rFonts w:ascii="Batang" w:hAnsi="Batang" w:eastAsia="Batang" w:cs="Batang"/>
           <w:sz w:val="28"/>
           <w:szCs w:val="28"/>
         </w:rPr>
       </w:pPr>
+      <w:r>
+        <w:rPr>
+          <w:rFonts w:ascii="Batang" w:hAnsi="Batang" w:eastAsia="Batang" w:cs="Batang"/>
+          <w:spacing w:val="-4"/>
+          <w:sz w:val="28"/>
+          <w:szCs w:val="28"/>
+        </w:rPr>
+        <w:t xml:space="preserve">  </w:t>
+      </w:r>
       <w:r>
         <w:rPr>
           <w:rFonts w:ascii="Batang" w:hAnsi="Batang" w:eastAsia="Batang" w:cs="Batang"/>
@@ -5659,266 +6323,677 @@
         <w:jc w:val="center"/>
         <w:rPr>
           <w:rFonts w:ascii="Batang" w:hAnsi="Batang" w:eastAsia="Batang" w:cs="Batang"/>
-          <w:sz w:val="24"/>
-          <w:szCs w:val="24"/>
+          <w:sz w:val="30"/>
+          <w:szCs w:val="30"/>
+        </w:rPr>
+      </w:pPr>
+      <w:r>
+        <w:rPr>
+          <w:rFonts w:ascii="Batang" w:hAnsi="Batang" w:eastAsia="Batang" w:cs="Batang"/>
+          <w:sz w:val="30"/>
+          <w:szCs w:val="30"/>
+        </w:rPr>
+        <w:t>20</w:t>
+      </w:r>
+      <w:r>
+        <w:rPr>
+          <w:rFonts w:ascii="Batang" w:hAnsi="Batang" w:eastAsia="Batang" w:cs="Batang"/>
+          <w:color w:val="FFFFFF" w:themeColor="background1" w:themeTint="FF" w:themeShade="FF"/>
+          <w:sz w:val="30"/>
+          <w:szCs w:val="30"/>
+          <w:u w:val="single"/>
+        </w:rPr>
+        <w:t>00</w:t>
+      </w:r>
+      <w:r>
+        <w:rPr>
+          <w:rFonts w:ascii="Batang" w:hAnsi="Batang" w:eastAsia="Batang" w:cs="Batang"/>
+          <w:sz w:val="30"/>
+          <w:szCs w:val="30"/>
+        </w:rPr>
+        <w:t xml:space="preserve"> </w:t>
+      </w:r>
+      <w:r>
+        <w:rPr>
+          <w:rFonts w:ascii="Batang" w:hAnsi="Batang" w:eastAsia="Batang" w:cs="Batang"/>
+          <w:sz w:val="30"/>
+          <w:szCs w:val="30"/>
+        </w:rPr>
+        <w:t xml:space="preserve">년 </w:t>
+      </w:r>
+      <w:r>
+        <w:rPr>
+          <w:rFonts w:ascii="Batang" w:hAnsi="Batang" w:eastAsia="Batang" w:cs="Batang"/>
+          <w:color w:val="FFFFFF" w:themeColor="background1" w:themeTint="FF" w:themeShade="FF"/>
+          <w:sz w:val="30"/>
+          <w:szCs w:val="30"/>
+        </w:rPr>
+        <w:t>01</w:t>
+      </w:r>
+      <w:r>
+        <w:rPr>
+          <w:rFonts w:ascii="Batang" w:hAnsi="Batang" w:eastAsia="Batang" w:cs="Batang"/>
+          <w:sz w:val="30"/>
+          <w:szCs w:val="30"/>
+        </w:rPr>
+        <w:t xml:space="preserve"> </w:t>
+      </w:r>
+      <w:r>
+        <w:rPr>
+          <w:rFonts w:ascii="Batang" w:hAnsi="Batang" w:eastAsia="Batang" w:cs="Batang"/>
+          <w:sz w:val="30"/>
+          <w:szCs w:val="30"/>
+        </w:rPr>
+        <w:t xml:space="preserve">월 </w:t>
+      </w:r>
+      <w:r>
+        <w:rPr>
+          <w:rFonts w:ascii="Batang" w:hAnsi="Batang" w:eastAsia="Batang" w:cs="Batang"/>
+          <w:color w:val="FFFFFF" w:themeColor="background1" w:themeTint="FF" w:themeShade="FF"/>
+          <w:sz w:val="30"/>
+          <w:szCs w:val="30"/>
+        </w:rPr>
+        <w:t>00</w:t>
+      </w:r>
+      <w:r>
+        <w:rPr>
+          <w:rFonts w:ascii="Batang" w:hAnsi="Batang" w:eastAsia="Batang" w:cs="Batang"/>
+          <w:sz w:val="30"/>
+          <w:szCs w:val="30"/>
+        </w:rPr>
+        <w:t xml:space="preserve"> </w:t>
+      </w:r>
+      <w:r>
+        <w:rPr>
+          <w:rFonts w:ascii="Batang" w:hAnsi="Batang" w:eastAsia="Batang" w:cs="Batang"/>
+          <w:sz w:val="30"/>
+          <w:szCs w:val="30"/>
+        </w:rPr>
+        <w:t>일</w:t>
+      </w:r>
+    </w:p>
+    <w:tbl>
+      <w:tblPr>
+        <w:tblStyle w:val="TableGrid"/>
+        <w:tblW w:w="0" w:type="auto"/>
+        <w:jc w:val="center"/>
+        <w:tblBorders>
+          <w:top w:val="single" w:color="FFFFFF" w:themeColor="background1" w:sz="8"/>
+          <w:left w:val="single" w:color="FFFFFF" w:themeColor="background1" w:sz="8"/>
+          <w:bottom w:val="single" w:color="FFFFFF" w:themeColor="background1" w:sz="8"/>
+          <w:right w:val="single" w:color="FFFFFF" w:themeColor="background1" w:sz="8"/>
+          <w:insideH w:val="single" w:color="FFFFFF" w:themeColor="background1" w:sz="8"/>
+          <w:insideV w:val="single" w:color="FFFFFF" w:themeColor="background1" w:sz="8"/>
+        </w:tblBorders>
+        <w:tblLook w:val="06A0" w:firstRow="1" w:lastRow="0" w:firstColumn="1" w:lastColumn="0" w:noHBand="1" w:noVBand="1"/>
+      </w:tblPr>
+      <w:tblGrid>
+        <w:gridCol w:w="1575"/>
+        <w:gridCol w:w="3257"/>
+      </w:tblGrid>
+      <w:tr>
+        <w:trPr>
+          <w:trHeight w:val="300"/>
+        </w:trPr>
+        <w:tc>
+          <w:tcPr>
+            <w:tcW w:w="1575" w:type="dxa"/>
+            <w:tcMar/>
+          </w:tcPr>
+          <w:p>
+            <w:pPr>
+              <w:pStyle w:val="a3"/>
+              <w:jc w:val="right"/>
+              <w:rPr>
+                <w:rFonts w:ascii="Batang" w:hAnsi="Batang" w:eastAsia="Batang" w:cs="Batang"/>
+                <w:sz w:val="30"/>
+                <w:szCs w:val="30"/>
+              </w:rPr>
+            </w:pPr>
+            <w:r>
+              <w:rPr>
+                <w:rFonts w:ascii="Batang" w:hAnsi="Batang" w:eastAsia="Batang" w:cs="Batang"/>
+                <w:sz w:val="30"/>
+                <w:szCs w:val="30"/>
+              </w:rPr>
+              <w:t>고소인</w:t>
+            </w:r>
+          </w:p>
+        </w:tc>
+        <w:tc>
+          <w:tcPr>
+            <w:tcW w:w="3257" w:type="dxa"/>
+            <w:tcMar/>
+            <w:vAlign w:val="center"/>
+          </w:tcPr>
+          <w:p>
+            <w:pPr>
+              <w:pStyle w:val="a3"/>
+              <w:jc w:val="right"/>
+              <w:rPr>
+                <w:rFonts w:ascii="Batang" w:hAnsi="Batang" w:eastAsia="Batang" w:cs="Batang"/>
+                <w:sz w:val="30"/>
+                <w:szCs w:val="30"/>
+                <w:vertAlign w:val="superscript"/>
+              </w:rPr>
+            </w:pPr>
+            <w:r>
+              <w:rPr>
+                <w:rFonts w:ascii="Batang" w:hAnsi="Batang" w:eastAsia="Batang" w:cs="Batang"/>
+                <w:sz w:val="30"/>
+                <w:szCs w:val="30"/>
+              </w:rPr>
+              <w:t xml:space="preserve">{{ </w:t>
+            </w:r>
+            <w:r>
+              <w:rPr>
+                <w:rFonts w:ascii="Batang" w:hAnsi="Batang" w:eastAsia="Batang" w:cs="Batang"/>
+                <w:sz w:val="30"/>
+                <w:szCs w:val="30"/>
+              </w:rPr>
+              <w:t>f</w:t>
+            </w:r>
+            <w:r>
+              <w:rPr>
+                <w:rFonts w:ascii="Batang" w:hAnsi="Batang" w:eastAsia="Batang" w:cs="Batang"/>
+                <w:sz w:val="30"/>
+                <w:szCs w:val="30"/>
+              </w:rPr>
+              <w:t>_</w:t>
+            </w:r>
+            <w:r>
+              <w:rPr>
+                <w:rFonts w:ascii="Batang" w:hAnsi="Batang" w:eastAsia="Batang" w:cs="Batang"/>
+                <w:sz w:val="30"/>
+                <w:szCs w:val="30"/>
+              </w:rPr>
+              <w:t>accuser_name</w:t>
+            </w:r>
+            <w:r>
+              <w:rPr>
+                <w:rFonts w:ascii="Batang" w:hAnsi="Batang" w:eastAsia="Batang" w:cs="Batang"/>
+                <w:sz w:val="30"/>
+                <w:szCs w:val="30"/>
+              </w:rPr>
+              <w:t xml:space="preserve"> }}</w:t>
+            </w:r>
+            <w:r>
+              <w:rPr>
+                <w:rFonts w:ascii="Batang" w:hAnsi="Batang" w:eastAsia="Batang" w:cs="Batang"/>
+                <w:sz w:val="30"/>
+                <w:szCs w:val="30"/>
+              </w:rPr>
+              <w:t xml:space="preserve"> (인)</w:t>
+            </w:r>
+            <w:r>
+              <w:rPr>
+                <w:rFonts w:ascii="Batang" w:hAnsi="Batang" w:eastAsia="Batang" w:cs="Batang"/>
+                <w:sz w:val="30"/>
+                <w:szCs w:val="30"/>
+                <w:vertAlign w:val="superscript"/>
+              </w:rPr>
+              <w:t>*</w:t>
+            </w:r>
+          </w:p>
+        </w:tc>
+      </w:tr>
+      <w:tr>
+        <w:trPr>
+          <w:trHeight w:val="300"/>
+        </w:trPr>
+        <w:tc>
+          <w:tcPr>
+            <w:tcW w:w="1575" w:type="dxa"/>
+            <w:tcMar/>
+          </w:tcPr>
+          <w:p>
+            <w:pPr>
+              <w:pStyle w:val="a3"/>
+              <w:jc w:val="right"/>
+              <w:rPr>
+                <w:rFonts w:ascii="Batang" w:hAnsi="Batang" w:eastAsia="Batang" w:cs="Batang"/>
+                <w:sz w:val="30"/>
+                <w:szCs w:val="30"/>
+              </w:rPr>
+            </w:pPr>
+            <w:r>
+              <w:rPr>
+                <w:rFonts w:ascii="Batang" w:hAnsi="Batang" w:eastAsia="Batang" w:cs="Batang"/>
+                <w:sz w:val="30"/>
+                <w:szCs w:val="30"/>
+              </w:rPr>
+              <w:t>제출인</w:t>
+            </w:r>
+          </w:p>
+        </w:tc>
+        <w:tc>
+          <w:tcPr>
+            <w:tcW w:w="3257" w:type="dxa"/>
+            <w:tcMar/>
+            <w:vAlign w:val="center"/>
+          </w:tcPr>
+          <w:p>
+            <w:pPr>
+              <w:pStyle w:val="a3"/>
+              <w:jc w:val="right"/>
+              <w:rPr>
+                <w:rFonts w:ascii="Batang" w:hAnsi="Batang" w:eastAsia="Batang" w:cs="Batang"/>
+                <w:sz w:val="30"/>
+                <w:szCs w:val="30"/>
+                <w:vertAlign w:val="superscript"/>
+              </w:rPr>
+            </w:pPr>
+            <w:r>
+              <w:rPr>
+                <w:rFonts w:ascii="Batang" w:hAnsi="Batang" w:eastAsia="Batang" w:cs="Batang"/>
+                <w:sz w:val="30"/>
+                <w:szCs w:val="30"/>
+              </w:rPr>
+              <w:t xml:space="preserve">{{ </w:t>
+            </w:r>
+            <w:r>
+              <w:rPr>
+                <w:rFonts w:ascii="Batang" w:hAnsi="Batang" w:eastAsia="Batang" w:cs="Batang"/>
+                <w:sz w:val="30"/>
+                <w:szCs w:val="30"/>
+              </w:rPr>
+              <w:t>f_submitter_name</w:t>
+            </w:r>
+            <w:r>
+              <w:rPr>
+                <w:rFonts w:ascii="Batang" w:hAnsi="Batang" w:eastAsia="Batang" w:cs="Batang"/>
+                <w:sz w:val="30"/>
+                <w:szCs w:val="30"/>
+              </w:rPr>
+              <w:t xml:space="preserve"> }}</w:t>
+            </w:r>
+            <w:r>
+              <w:rPr>
+                <w:rFonts w:ascii="Batang" w:hAnsi="Batang" w:eastAsia="Batang" w:cs="Batang"/>
+                <w:sz w:val="30"/>
+                <w:szCs w:val="30"/>
+              </w:rPr>
+              <w:t xml:space="preserve"> (인) </w:t>
+            </w:r>
+          </w:p>
+        </w:tc>
+      </w:tr>
+    </w:tbl>
+    <w:p>
+      <w:pPr>
+        <w:pStyle w:val="a3"/>
+        <w:suppressLineNumbers w:val="0"/>
+        <w:bidi w:val="0"/>
+        <w:spacing w:beforeLines="0" w:beforeAutospacing="off" w:after="0" w:afterAutospacing="off" w:line="432" w:lineRule="auto"/>
+        <w:ind w:left="0" w:rightChars="0"/>
+        <w:jc w:val="center"/>
+        <w:rPr>
+          <w:rFonts w:ascii="Batang" w:hAnsi="Batang" w:eastAsia="Batang" w:cs="Batang"/>
+          <w:sz w:val="30"/>
+          <w:szCs w:val="30"/>
         </w:rPr>
       </w:pPr>
     </w:p>
     <w:p>
       <w:pPr>
-        <w:pStyle w:val="a3"/>
         <w:wordWrap/>
-        <w:spacing w:line="432" w:lineRule="auto"/>
-        <w:jc w:val="center"/>
-        <w:rPr>
-          <w:rFonts w:ascii="Batang" w:hAnsi="Batang" w:eastAsia="Batang" w:cs="Batang"/>
-          <w:sz w:val="24"/>
-          <w:szCs w:val="24"/>
+        <w:spacing w:after="0" w:line="276" w:lineRule="auto"/>
+        <w:ind w:left="540" w:right="300" w:hanging="540"/>
+        <w:jc w:val="right"/>
+        <w:rPr>
+          <w:rFonts w:ascii="Batang" w:hAnsi="Batang" w:eastAsia="Batang" w:cs="Batang"/>
+          <w:color w:val="000000" w:themeColor="text1" w:themeTint="FF" w:themeShade="FF"/>
+          <w:sz w:val="22"/>
+          <w:szCs w:val="22"/>
         </w:rPr>
       </w:pPr>
+      <w:r>
+        <w:rPr>
+          <w:rFonts w:ascii="Batang" w:hAnsi="Batang" w:eastAsia="Batang" w:cs="Batang"/>
+          <w:color w:val="000000" w:themeColor="text1" w:themeTint="FF" w:themeShade="FF"/>
+          <w:sz w:val="22"/>
+          <w:szCs w:val="22"/>
+        </w:rPr>
+        <w:t xml:space="preserve">※ </w:t>
+      </w:r>
+      <w:r>
+        <w:rPr>
+          <w:rFonts w:ascii="Batang" w:hAnsi="Batang" w:eastAsia="Batang" w:cs="Batang"/>
+          <w:color w:val="000000" w:themeColor="text1" w:themeTint="FF" w:themeShade="FF"/>
+          <w:sz w:val="22"/>
+          <w:szCs w:val="22"/>
+        </w:rPr>
+        <w:t>고소장</w:t>
+      </w:r>
+      <w:r>
+        <w:rPr>
+          <w:rFonts w:ascii="Batang" w:hAnsi="Batang" w:eastAsia="Batang" w:cs="Batang"/>
+          <w:color w:val="000000" w:themeColor="text1" w:themeTint="FF" w:themeShade="FF"/>
+          <w:sz w:val="22"/>
+          <w:szCs w:val="22"/>
+        </w:rPr>
+        <w:t xml:space="preserve"> 제출일을 </w:t>
+      </w:r>
+      <w:r>
+        <w:rPr>
+          <w:rFonts w:ascii="Batang" w:hAnsi="Batang" w:eastAsia="Batang" w:cs="Batang"/>
+          <w:color w:val="000000" w:themeColor="text1" w:themeTint="FF" w:themeShade="FF"/>
+          <w:sz w:val="22"/>
+          <w:szCs w:val="22"/>
+        </w:rPr>
+        <w:t>기재하여야</w:t>
+      </w:r>
+      <w:r>
+        <w:rPr>
+          <w:rFonts w:ascii="Batang" w:hAnsi="Batang" w:eastAsia="Batang" w:cs="Batang"/>
+          <w:color w:val="000000" w:themeColor="text1" w:themeTint="FF" w:themeShade="FF"/>
+          <w:sz w:val="22"/>
+          <w:szCs w:val="22"/>
+        </w:rPr>
+        <w:t xml:space="preserve"> 하며,</w:t>
+      </w:r>
     </w:p>
     <w:p>
       <w:pPr>
-        <w:pStyle w:val="a3"/>
         <w:wordWrap/>
-        <w:spacing w:line="432" w:lineRule="auto"/>
-        <w:jc w:val="center"/>
-        <w:rPr>
-          <w:rFonts w:ascii="Batang" w:hAnsi="Batang" w:eastAsia="Batang" w:cs="Batang"/>
-          <w:sz w:val="24"/>
-          <w:szCs w:val="24"/>
+        <w:spacing w:after="0" w:line="276" w:lineRule="auto"/>
+        <w:ind w:left="540" w:right="300" w:hanging="540"/>
+        <w:jc w:val="right"/>
+        <w:rPr>
+          <w:rFonts w:ascii="Batang" w:hAnsi="Batang" w:eastAsia="Batang" w:cs="Batang"/>
+          <w:color w:val="000000" w:themeColor="text1" w:themeTint="FF" w:themeShade="FF"/>
+          <w:sz w:val="22"/>
+          <w:szCs w:val="22"/>
         </w:rPr>
       </w:pPr>
+      <w:r>
+        <w:rPr>
+          <w:rFonts w:ascii="Batang" w:hAnsi="Batang" w:eastAsia="Batang" w:cs="Batang"/>
+          <w:color w:val="000000" w:themeColor="text1" w:themeTint="FF" w:themeShade="FF"/>
+          <w:sz w:val="22"/>
+          <w:szCs w:val="22"/>
+        </w:rPr>
+        <w:t>고소인</w:t>
+      </w:r>
+      <w:r>
+        <w:rPr>
+          <w:rFonts w:ascii="Batang" w:hAnsi="Batang" w:eastAsia="Batang" w:cs="Batang"/>
+          <w:color w:val="000000" w:themeColor="text1" w:themeTint="FF" w:themeShade="FF"/>
+          <w:sz w:val="22"/>
+          <w:szCs w:val="22"/>
+        </w:rPr>
+        <w:t xml:space="preserve"> </w:t>
+      </w:r>
+      <w:r>
+        <w:rPr>
+          <w:rFonts w:ascii="Batang" w:hAnsi="Batang" w:eastAsia="Batang" w:cs="Batang"/>
+          <w:color w:val="000000" w:themeColor="text1" w:themeTint="FF" w:themeShade="FF"/>
+          <w:sz w:val="22"/>
+          <w:szCs w:val="22"/>
+        </w:rPr>
+        <w:t>난에는</w:t>
+      </w:r>
+      <w:r>
+        <w:rPr>
+          <w:rFonts w:ascii="Batang" w:hAnsi="Batang" w:eastAsia="Batang" w:cs="Batang"/>
+          <w:color w:val="000000" w:themeColor="text1" w:themeTint="FF" w:themeShade="FF"/>
+          <w:sz w:val="22"/>
+          <w:szCs w:val="22"/>
+        </w:rPr>
+        <w:t xml:space="preserve"> </w:t>
+      </w:r>
+      <w:r>
+        <w:rPr>
+          <w:rFonts w:ascii="Batang" w:hAnsi="Batang" w:eastAsia="Batang" w:cs="Batang"/>
+          <w:color w:val="000000" w:themeColor="text1" w:themeTint="FF" w:themeShade="FF"/>
+          <w:sz w:val="22"/>
+          <w:szCs w:val="22"/>
+        </w:rPr>
+        <w:t>고소인이</w:t>
+      </w:r>
+      <w:r>
+        <w:rPr>
+          <w:rFonts w:ascii="Batang" w:hAnsi="Batang" w:eastAsia="Batang" w:cs="Batang"/>
+          <w:color w:val="000000" w:themeColor="text1" w:themeTint="FF" w:themeShade="FF"/>
+          <w:sz w:val="22"/>
+          <w:szCs w:val="22"/>
+        </w:rPr>
+        <w:t xml:space="preserve"> </w:t>
+      </w:r>
+      <w:r>
+        <w:rPr>
+          <w:rFonts w:ascii="Batang" w:hAnsi="Batang" w:eastAsia="Batang" w:cs="Batang"/>
+          <w:color w:val="000000" w:themeColor="text1" w:themeTint="FF" w:themeShade="FF"/>
+          <w:sz w:val="22"/>
+          <w:szCs w:val="22"/>
+        </w:rPr>
+        <w:t>직접</w:t>
+      </w:r>
+      <w:r>
+        <w:rPr>
+          <w:rFonts w:ascii="Batang" w:hAnsi="Batang" w:eastAsia="Batang" w:cs="Batang"/>
+          <w:color w:val="000000" w:themeColor="text1" w:themeTint="FF" w:themeShade="FF"/>
+          <w:sz w:val="22"/>
+          <w:szCs w:val="22"/>
+        </w:rPr>
+        <w:t xml:space="preserve"> </w:t>
+      </w:r>
+      <w:r>
+        <w:rPr>
+          <w:rFonts w:ascii="Batang" w:hAnsi="Batang" w:eastAsia="Batang" w:cs="Batang"/>
+          <w:color w:val="000000" w:themeColor="text1" w:themeTint="FF" w:themeShade="FF"/>
+          <w:sz w:val="22"/>
+          <w:szCs w:val="22"/>
+        </w:rPr>
+        <w:t>자필로</w:t>
+      </w:r>
+      <w:r>
+        <w:rPr>
+          <w:rFonts w:ascii="Batang" w:hAnsi="Batang" w:eastAsia="Batang" w:cs="Batang"/>
+          <w:color w:val="000000" w:themeColor="text1" w:themeTint="FF" w:themeShade="FF"/>
+          <w:sz w:val="22"/>
+          <w:szCs w:val="22"/>
+        </w:rPr>
+        <w:t xml:space="preserve"> </w:t>
+      </w:r>
+      <w:r>
+        <w:rPr>
+          <w:rFonts w:ascii="Batang" w:hAnsi="Batang" w:eastAsia="Batang" w:cs="Batang"/>
+          <w:color w:val="000000" w:themeColor="text1" w:themeTint="FF" w:themeShade="FF"/>
+          <w:sz w:val="22"/>
+          <w:szCs w:val="22"/>
+        </w:rPr>
+        <w:t>서명</w:t>
+      </w:r>
+      <w:r>
+        <w:rPr>
+          <w:rFonts w:ascii="Batang" w:hAnsi="Batang" w:eastAsia="Batang" w:cs="Batang"/>
+          <w:color w:val="000000" w:themeColor="text1" w:themeTint="FF" w:themeShade="FF"/>
+          <w:sz w:val="22"/>
+          <w:szCs w:val="22"/>
+        </w:rPr>
+        <w:t xml:space="preserve"> 날(무)인 </w:t>
+      </w:r>
+      <w:r>
+        <w:rPr>
+          <w:rFonts w:ascii="Batang" w:hAnsi="Batang" w:eastAsia="Batang" w:cs="Batang"/>
+          <w:color w:val="000000" w:themeColor="text1" w:themeTint="FF" w:themeShade="FF"/>
+          <w:sz w:val="22"/>
+          <w:szCs w:val="22"/>
+        </w:rPr>
+        <w:t>해야</w:t>
+      </w:r>
+      <w:r>
+        <w:rPr>
+          <w:rFonts w:ascii="Batang" w:hAnsi="Batang" w:eastAsia="Batang" w:cs="Batang"/>
+          <w:color w:val="000000" w:themeColor="text1" w:themeTint="FF" w:themeShade="FF"/>
+          <w:sz w:val="22"/>
+          <w:szCs w:val="22"/>
+        </w:rPr>
+        <w:t xml:space="preserve"> </w:t>
+      </w:r>
+      <w:r>
+        <w:rPr>
+          <w:rFonts w:ascii="Batang" w:hAnsi="Batang" w:eastAsia="Batang" w:cs="Batang"/>
+          <w:color w:val="000000" w:themeColor="text1" w:themeTint="FF" w:themeShade="FF"/>
+          <w:sz w:val="22"/>
+          <w:szCs w:val="22"/>
+        </w:rPr>
+        <w:t>합니다</w:t>
+      </w:r>
+      <w:r>
+        <w:rPr>
+          <w:rFonts w:ascii="Batang" w:hAnsi="Batang" w:eastAsia="Batang" w:cs="Batang"/>
+          <w:color w:val="000000" w:themeColor="text1" w:themeTint="FF" w:themeShade="FF"/>
+          <w:sz w:val="22"/>
+          <w:szCs w:val="22"/>
+        </w:rPr>
+        <w:t>.</w:t>
+      </w:r>
     </w:p>
     <w:p>
       <w:pPr>
-        <w:pStyle w:val="a3"/>
         <w:wordWrap/>
-        <w:spacing w:line="432" w:lineRule="auto"/>
-        <w:jc w:val="center"/>
-        <w:rPr>
-          <w:rFonts w:ascii="Batang" w:hAnsi="Batang" w:eastAsia="Batang" w:cs="Batang"/>
-          <w:sz w:val="30"/>
-          <w:szCs w:val="30"/>
+        <w:spacing w:after="0" w:line="276" w:lineRule="auto"/>
+        <w:ind w:left="540" w:right="300" w:hanging="540"/>
+        <w:jc w:val="right"/>
+        <w:rPr>
+          <w:rFonts w:ascii="Batang" w:hAnsi="Batang" w:eastAsia="Batang" w:cs="Batang"/>
+          <w:color w:val="000000" w:themeColor="text1" w:themeTint="FF" w:themeShade="FF"/>
+          <w:sz w:val="22"/>
+          <w:szCs w:val="22"/>
         </w:rPr>
       </w:pPr>
       <w:r>
         <w:rPr>
           <w:rFonts w:ascii="Batang" w:hAnsi="Batang" w:eastAsia="Batang" w:cs="Batang"/>
-          <w:sz w:val="30"/>
-          <w:szCs w:val="30"/>
-        </w:rPr>
-        <w:t>20</w:t>
-      </w:r>
-      <w:r>
-        <w:rPr>
-          <w:rFonts w:ascii="Batang" w:hAnsi="Batang" w:eastAsia="Batang" w:cs="Batang"/>
-          <w:sz w:val="30"/>
-          <w:szCs w:val="30"/>
-        </w:rPr>
-        <w:t>23</w:t>
-      </w:r>
-      <w:r>
-        <w:rPr>
-          <w:rFonts w:ascii="Batang" w:hAnsi="Batang" w:eastAsia="Batang" w:cs="Batang"/>
-          <w:sz w:val="30"/>
-          <w:szCs w:val="30"/>
+          <w:color w:val="000000" w:themeColor="text1" w:themeTint="FF" w:themeShade="FF"/>
+          <w:sz w:val="22"/>
+          <w:szCs w:val="22"/>
+        </w:rPr>
+        <w:t>또한</w:t>
+      </w:r>
+      <w:r>
+        <w:rPr>
+          <w:rFonts w:ascii="Batang" w:hAnsi="Batang" w:eastAsia="Batang" w:cs="Batang"/>
+          <w:color w:val="000000" w:themeColor="text1" w:themeTint="FF" w:themeShade="FF"/>
+          <w:sz w:val="22"/>
+          <w:szCs w:val="22"/>
+        </w:rPr>
+        <w:t xml:space="preserve"> 법정대리인이나 </w:t>
+      </w:r>
+      <w:r>
+        <w:rPr>
+          <w:rFonts w:ascii="Batang" w:hAnsi="Batang" w:eastAsia="Batang" w:cs="Batang"/>
+          <w:color w:val="000000" w:themeColor="text1" w:themeTint="FF" w:themeShade="FF"/>
+          <w:sz w:val="22"/>
+          <w:szCs w:val="22"/>
+        </w:rPr>
+        <w:t>변호사에</w:t>
+      </w:r>
+      <w:r>
+        <w:rPr>
+          <w:rFonts w:ascii="Batang" w:hAnsi="Batang" w:eastAsia="Batang" w:cs="Batang"/>
+          <w:color w:val="000000" w:themeColor="text1" w:themeTint="FF" w:themeShade="FF"/>
+          <w:sz w:val="22"/>
+          <w:szCs w:val="22"/>
+        </w:rPr>
+        <w:t xml:space="preserve"> 의한 </w:t>
+      </w:r>
+      <w:r>
+        <w:rPr>
+          <w:rFonts w:ascii="Batang" w:hAnsi="Batang" w:eastAsia="Batang" w:cs="Batang"/>
+          <w:color w:val="000000" w:themeColor="text1" w:themeTint="FF" w:themeShade="FF"/>
+          <w:sz w:val="22"/>
+          <w:szCs w:val="22"/>
+        </w:rPr>
+        <w:t>고소대리의</w:t>
+      </w:r>
+      <w:r>
+        <w:rPr>
+          <w:rFonts w:ascii="Batang" w:hAnsi="Batang" w:eastAsia="Batang" w:cs="Batang"/>
+          <w:color w:val="000000" w:themeColor="text1" w:themeTint="FF" w:themeShade="FF"/>
+          <w:sz w:val="22"/>
+          <w:szCs w:val="22"/>
         </w:rPr>
         <w:t xml:space="preserve"> </w:t>
       </w:r>
       <w:r>
         <w:rPr>
           <w:rFonts w:ascii="Batang" w:hAnsi="Batang" w:eastAsia="Batang" w:cs="Batang"/>
-          <w:sz w:val="30"/>
-          <w:szCs w:val="30"/>
-        </w:rPr>
-        <w:t xml:space="preserve">년 </w:t>
-      </w:r>
-      <w:r>
-        <w:rPr>
-          <w:rFonts w:ascii="Batang" w:hAnsi="Batang" w:eastAsia="Batang" w:cs="Batang"/>
-          <w:sz w:val="30"/>
-          <w:szCs w:val="30"/>
-        </w:rPr>
-        <w:t xml:space="preserve">08 </w:t>
-      </w:r>
-      <w:r>
-        <w:rPr>
-          <w:rFonts w:ascii="Batang" w:hAnsi="Batang" w:eastAsia="Batang" w:cs="Batang"/>
-          <w:sz w:val="30"/>
-          <w:szCs w:val="30"/>
-        </w:rPr>
-        <w:t xml:space="preserve">월 </w:t>
-      </w:r>
-      <w:r>
-        <w:rPr>
-          <w:rFonts w:ascii="Batang" w:hAnsi="Batang" w:eastAsia="Batang" w:cs="Batang"/>
-          <w:sz w:val="30"/>
-          <w:szCs w:val="30"/>
-        </w:rPr>
-        <w:t xml:space="preserve">15 </w:t>
-      </w:r>
-      <w:r>
-        <w:rPr>
-          <w:rFonts w:ascii="Batang" w:hAnsi="Batang" w:eastAsia="Batang" w:cs="Batang"/>
-          <w:sz w:val="30"/>
-          <w:szCs w:val="30"/>
-        </w:rPr>
-        <w:t>일</w:t>
+          <w:color w:val="000000" w:themeColor="text1" w:themeTint="FF" w:themeShade="FF"/>
+          <w:sz w:val="22"/>
+          <w:szCs w:val="22"/>
+        </w:rPr>
+        <w:t>경우에는</w:t>
       </w:r>
     </w:p>
     <w:p>
       <w:pPr>
-        <w:pStyle w:val="a3"/>
         <w:wordWrap/>
-        <w:spacing w:line="432" w:lineRule="auto"/>
-        <w:jc w:val="center"/>
-        <w:rPr>
-          <w:rFonts w:ascii="Batang" w:hAnsi="Batang" w:eastAsia="Batang" w:cs="Batang"/>
-          <w:sz w:val="30"/>
-          <w:szCs w:val="30"/>
-          <w:lang w:val="en-US"/>
+        <w:spacing w:after="0" w:line="276" w:lineRule="auto"/>
+        <w:ind w:left="540" w:right="300" w:hanging="540"/>
+        <w:jc w:val="right"/>
+        <w:rPr>
+          <w:rFonts w:ascii="Batang" w:hAnsi="Batang" w:eastAsia="Batang" w:cs="Batang"/>
+          <w:color w:val="000000" w:themeColor="text1" w:themeTint="FF" w:themeShade="FF"/>
+          <w:sz w:val="22"/>
+          <w:szCs w:val="22"/>
         </w:rPr>
       </w:pPr>
       <w:r>
         <w:rPr>
           <w:rFonts w:ascii="Batang" w:hAnsi="Batang" w:eastAsia="Batang" w:cs="Batang"/>
-          <w:sz w:val="30"/>
-          <w:szCs w:val="30"/>
-          <w:lang w:val="en-US"/>
-        </w:rPr>
-        <w:t>고소인</w:t>
-      </w:r>
-      <w:r>
-        <w:rPr>
-          <w:rFonts w:ascii="Batang" w:hAnsi="Batang" w:eastAsia="Batang" w:cs="Batang"/>
-          <w:sz w:val="30"/>
-          <w:szCs w:val="30"/>
-          <w:lang w:val="en-US"/>
+          <w:color w:val="000000" w:themeColor="text1" w:themeTint="FF" w:themeShade="FF"/>
+          <w:sz w:val="22"/>
+          <w:szCs w:val="22"/>
+        </w:rPr>
+        <w:t>제출인을</w:t>
+      </w:r>
+      <w:r>
+        <w:rPr>
+          <w:rFonts w:ascii="Batang" w:hAnsi="Batang" w:eastAsia="Batang" w:cs="Batang"/>
+          <w:color w:val="000000" w:themeColor="text1" w:themeTint="FF" w:themeShade="FF"/>
+          <w:sz w:val="22"/>
+          <w:szCs w:val="22"/>
         </w:rPr>
         <w:t xml:space="preserve"> </w:t>
       </w:r>
       <w:r>
         <w:rPr>
           <w:rFonts w:ascii="Batang" w:hAnsi="Batang" w:eastAsia="Batang" w:cs="Batang"/>
-          <w:sz w:val="30"/>
-          <w:szCs w:val="30"/>
-          <w:lang w:val="en-US"/>
-        </w:rPr>
-        <w:t xml:space="preserve">                      </w:t>
-      </w:r>
-      <w:r>
-        <w:rPr>
-          <w:rFonts w:ascii="Batang" w:hAnsi="Batang" w:eastAsia="Batang" w:cs="Batang"/>
-          <w:sz w:val="30"/>
-          <w:szCs w:val="30"/>
-          <w:lang w:val="en-US"/>
-        </w:rPr>
-        <w:t xml:space="preserve">   </w:t>
-      </w:r>
-      <w:r>
-        <w:rPr>
-          <w:rFonts w:ascii="Batang" w:hAnsi="Batang" w:eastAsia="Batang" w:cs="Batang"/>
-          <w:sz w:val="30"/>
-          <w:szCs w:val="30"/>
-          <w:lang w:val="en-US"/>
-        </w:rPr>
-        <w:t>(</w:t>
-      </w:r>
-      <w:r>
-        <w:rPr>
-          <w:rFonts w:ascii="Batang" w:hAnsi="Batang" w:eastAsia="Batang" w:cs="Batang"/>
-          <w:sz w:val="30"/>
-          <w:szCs w:val="30"/>
-          <w:lang w:val="en-US"/>
-        </w:rPr>
-        <w:t>인</w:t>
-      </w:r>
-      <w:r>
-        <w:rPr>
-          <w:rFonts w:ascii="Batang" w:hAnsi="Batang" w:eastAsia="Batang" w:cs="Batang"/>
-          <w:sz w:val="30"/>
-          <w:szCs w:val="30"/>
-          <w:lang w:val="en-US"/>
-        </w:rPr>
-        <w:t>)</w:t>
-      </w:r>
-    </w:p>
-    <w:p>
-      <w:pPr>
-        <w:pStyle w:val="a3"/>
-        <w:wordWrap/>
-        <w:spacing w:line="432" w:lineRule="auto"/>
-        <w:jc w:val="center"/>
-        <w:rPr>
-          <w:rFonts w:ascii="Batang" w:hAnsi="Batang" w:eastAsia="Batang" w:cs="Batang"/>
-          <w:sz w:val="30"/>
-          <w:szCs w:val="30"/>
-          <w:lang w:val="en-US"/>
-        </w:rPr>
-      </w:pPr>
-      <w:r>
-        <w:rPr>
-          <w:rFonts w:ascii="Batang" w:hAnsi="Batang" w:eastAsia="Batang" w:cs="Batang"/>
-          <w:sz w:val="30"/>
-          <w:szCs w:val="30"/>
-          <w:lang w:val="en-US"/>
-        </w:rPr>
-        <w:t>제출인</w:t>
-      </w:r>
-      <w:r>
-        <w:rPr>
-          <w:rFonts w:ascii="Batang" w:hAnsi="Batang" w:eastAsia="Batang" w:cs="Batang"/>
-          <w:sz w:val="30"/>
-          <w:szCs w:val="30"/>
-          <w:lang w:val="en-US"/>
+          <w:color w:val="000000" w:themeColor="text1" w:themeTint="FF" w:themeShade="FF"/>
+          <w:sz w:val="22"/>
+          <w:szCs w:val="22"/>
+        </w:rPr>
+        <w:t>기재하여야</w:t>
+      </w:r>
+      <w:r>
+        <w:rPr>
+          <w:rFonts w:ascii="Batang" w:hAnsi="Batang" w:eastAsia="Batang" w:cs="Batang"/>
+          <w:color w:val="000000" w:themeColor="text1" w:themeTint="FF" w:themeShade="FF"/>
+          <w:sz w:val="22"/>
+          <w:szCs w:val="22"/>
         </w:rPr>
         <w:t xml:space="preserve"> </w:t>
       </w:r>
       <w:r>
         <w:rPr>
           <w:rFonts w:ascii="Batang" w:hAnsi="Batang" w:eastAsia="Batang" w:cs="Batang"/>
-          <w:sz w:val="30"/>
-          <w:szCs w:val="30"/>
-          <w:lang w:val="en-US"/>
-        </w:rPr>
-        <w:t xml:space="preserve">                      </w:t>
-      </w:r>
-      <w:r>
-        <w:rPr>
-          <w:rFonts w:ascii="Batang" w:hAnsi="Batang" w:eastAsia="Batang" w:cs="Batang"/>
-          <w:sz w:val="30"/>
-          <w:szCs w:val="30"/>
-          <w:lang w:val="en-US"/>
-        </w:rPr>
-        <w:t xml:space="preserve">   </w:t>
-      </w:r>
-      <w:r>
-        <w:rPr>
-          <w:rFonts w:ascii="Batang" w:hAnsi="Batang" w:eastAsia="Batang" w:cs="Batang"/>
-          <w:sz w:val="30"/>
-          <w:szCs w:val="30"/>
-          <w:lang w:val="en-US"/>
-        </w:rPr>
-        <w:t>(</w:t>
-      </w:r>
-      <w:r>
-        <w:rPr>
-          <w:rFonts w:ascii="Batang" w:hAnsi="Batang" w:eastAsia="Batang" w:cs="Batang"/>
-          <w:sz w:val="30"/>
-          <w:szCs w:val="30"/>
-          <w:lang w:val="en-US"/>
-        </w:rPr>
-        <w:t>인</w:t>
-      </w:r>
-      <w:r>
-        <w:rPr>
-          <w:rFonts w:ascii="Batang" w:hAnsi="Batang" w:eastAsia="Batang" w:cs="Batang"/>
-          <w:sz w:val="30"/>
-          <w:szCs w:val="30"/>
-          <w:lang w:val="en-US"/>
-        </w:rPr>
-        <w:t>)</w:t>
+          <w:color w:val="000000" w:themeColor="text1" w:themeTint="FF" w:themeShade="FF"/>
+          <w:sz w:val="22"/>
+          <w:szCs w:val="22"/>
+        </w:rPr>
+        <w:t>합니다</w:t>
+      </w:r>
+      <w:r>
+        <w:rPr>
+          <w:rFonts w:ascii="Batang" w:hAnsi="Batang" w:eastAsia="Batang" w:cs="Batang"/>
+          <w:color w:val="000000" w:themeColor="text1" w:themeTint="FF" w:themeShade="FF"/>
+          <w:sz w:val="22"/>
+          <w:szCs w:val="22"/>
+        </w:rPr>
+        <w:t>.</w:t>
       </w:r>
     </w:p>
     <w:p>
@@ -5937,35 +7012,12 @@
     <w:p>
       <w:pPr>
         <w:pStyle w:val="a3"/>
+        <w:widowControl/>
         <w:wordWrap/>
+        <w:autoSpaceDE/>
+        <w:autoSpaceDN/>
         <w:spacing w:line="432" w:lineRule="auto"/>
-        <w:jc w:val="left"/>
-        <w:rPr>
-          <w:rFonts w:ascii="Batang" w:hAnsi="Batang" w:eastAsia="Batang" w:cs="Batang"/>
-          <w:sz w:val="24"/>
-          <w:szCs w:val="24"/>
-        </w:rPr>
-      </w:pPr>
-    </w:p>
-    <w:p>
-      <w:pPr>
-        <w:pStyle w:val="a3"/>
-        <w:wordWrap/>
-        <w:spacing w:line="432" w:lineRule="auto"/>
-        <w:jc w:val="left"/>
-        <w:rPr>
-          <w:rFonts w:ascii="Batang" w:hAnsi="Batang" w:eastAsia="Batang" w:cs="Batang"/>
-          <w:sz w:val="24"/>
-          <w:szCs w:val="24"/>
-        </w:rPr>
-      </w:pPr>
-    </w:p>
-    <w:p>
-      <w:pPr>
-        <w:pStyle w:val="a3"/>
-        <w:wordWrap/>
-        <w:spacing w:line="432" w:lineRule="auto"/>
-        <w:jc w:val="right"/>
+        <w:jc w:val="center"/>
         <w:rPr>
           <w:rFonts w:ascii="Batang" w:hAnsi="Batang" w:eastAsia="Batang" w:cs="Batang"/>
           <w:b w:val="1"/>
@@ -5982,7 +7034,7 @@
           <w:sz w:val="30"/>
           <w:szCs w:val="30"/>
         </w:rPr>
-        <w:t>X</w:t>
+        <w:t xml:space="preserve">{{ </w:t>
       </w:r>
       <w:r>
         <w:rPr>
@@ -5992,7 +7044,7 @@
           <w:sz w:val="30"/>
           <w:szCs w:val="30"/>
         </w:rPr>
-        <w:t>X</w:t>
+        <w:t>f</w:t>
       </w:r>
       <w:r>
         <w:rPr>
@@ -6002,7 +7054,17 @@
           <w:sz w:val="30"/>
           <w:szCs w:val="30"/>
         </w:rPr>
-        <w:t>경찰서</w:t>
+        <w:t xml:space="preserve">_police </w:t>
+      </w:r>
+      <w:r>
+        <w:rPr>
+          <w:rFonts w:ascii="Batang" w:hAnsi="Batang" w:eastAsia="Batang" w:cs="Batang"/>
+          <w:b w:val="1"/>
+          <w:bCs w:val="1"/>
+          <w:sz w:val="30"/>
+          <w:szCs w:val="30"/>
+        </w:rPr>
+        <w:t>}}</w:t>
       </w:r>
       <w:r>
         <w:rPr>
@@ -6028,10 +7090,204 @@
     </w:p>
     <w:p>
       <w:pPr>
+        <w:spacing w:after="0" w:line="276" w:lineRule="auto"/>
+        <w:ind w:left="540" w:right="300" w:hanging="540"/>
+        <w:jc w:val="right"/>
+        <w:rPr>
+          <w:rFonts w:ascii="Batang" w:hAnsi="Batang" w:eastAsia="Batang" w:cs="Batang"/>
+          <w:color w:val="000000" w:themeColor="text1" w:themeTint="FF" w:themeShade="FF"/>
+          <w:sz w:val="22"/>
+          <w:szCs w:val="22"/>
+        </w:rPr>
+      </w:pPr>
+      <w:r>
+        <w:rPr>
+          <w:rFonts w:ascii="Batang" w:hAnsi="Batang" w:eastAsia="Batang" w:cs="Batang"/>
+          <w:color w:val="000000" w:themeColor="text1" w:themeTint="FF" w:themeShade="FF"/>
+          <w:sz w:val="22"/>
+          <w:szCs w:val="22"/>
+        </w:rPr>
+        <w:t xml:space="preserve">※ </w:t>
+      </w:r>
+      <w:r>
+        <w:rPr>
+          <w:rFonts w:ascii="Batang" w:hAnsi="Batang" w:eastAsia="Batang" w:cs="Batang"/>
+          <w:color w:val="000000" w:themeColor="text1" w:themeTint="FF" w:themeShade="FF"/>
+          <w:sz w:val="22"/>
+          <w:szCs w:val="22"/>
+        </w:rPr>
+        <w:t>고소장은</w:t>
+      </w:r>
+      <w:r>
+        <w:rPr>
+          <w:rFonts w:ascii="Batang" w:hAnsi="Batang" w:eastAsia="Batang" w:cs="Batang"/>
+          <w:color w:val="000000" w:themeColor="text1" w:themeTint="FF" w:themeShade="FF"/>
+          <w:sz w:val="22"/>
+          <w:szCs w:val="22"/>
+        </w:rPr>
+        <w:t xml:space="preserve"> </w:t>
+      </w:r>
+      <w:r>
+        <w:rPr>
+          <w:rFonts w:ascii="Batang" w:hAnsi="Batang" w:eastAsia="Batang" w:cs="Batang"/>
+          <w:color w:val="000000" w:themeColor="text1" w:themeTint="FF" w:themeShade="FF"/>
+          <w:sz w:val="22"/>
+          <w:szCs w:val="22"/>
+        </w:rPr>
+        <w:t>가까운</w:t>
+      </w:r>
+      <w:r>
+        <w:rPr>
+          <w:rFonts w:ascii="Batang" w:hAnsi="Batang" w:eastAsia="Batang" w:cs="Batang"/>
+          <w:color w:val="000000" w:themeColor="text1" w:themeTint="FF" w:themeShade="FF"/>
+          <w:sz w:val="22"/>
+          <w:szCs w:val="22"/>
+        </w:rPr>
+        <w:t xml:space="preserve"> </w:t>
+      </w:r>
+      <w:r>
+        <w:rPr>
+          <w:rFonts w:ascii="Batang" w:hAnsi="Batang" w:eastAsia="Batang" w:cs="Batang"/>
+          <w:color w:val="000000" w:themeColor="text1" w:themeTint="FF" w:themeShade="FF"/>
+          <w:sz w:val="22"/>
+          <w:szCs w:val="22"/>
+        </w:rPr>
+        <w:t>경찰서에</w:t>
+      </w:r>
+      <w:r>
+        <w:rPr>
+          <w:rFonts w:ascii="Batang" w:hAnsi="Batang" w:eastAsia="Batang" w:cs="Batang"/>
+          <w:color w:val="000000" w:themeColor="text1" w:themeTint="FF" w:themeShade="FF"/>
+          <w:sz w:val="22"/>
+          <w:szCs w:val="22"/>
+        </w:rPr>
+        <w:t xml:space="preserve"> </w:t>
+      </w:r>
+      <w:r>
+        <w:rPr>
+          <w:rFonts w:ascii="Batang" w:hAnsi="Batang" w:eastAsia="Batang" w:cs="Batang"/>
+          <w:color w:val="000000" w:themeColor="text1" w:themeTint="FF" w:themeShade="FF"/>
+          <w:sz w:val="22"/>
+          <w:szCs w:val="22"/>
+        </w:rPr>
+        <w:t>제출하셔도</w:t>
+      </w:r>
+      <w:r>
+        <w:rPr>
+          <w:rFonts w:ascii="Batang" w:hAnsi="Batang" w:eastAsia="Batang" w:cs="Batang"/>
+          <w:color w:val="000000" w:themeColor="text1" w:themeTint="FF" w:themeShade="FF"/>
+          <w:sz w:val="22"/>
+          <w:szCs w:val="22"/>
+        </w:rPr>
+        <w:t xml:space="preserve"> </w:t>
+      </w:r>
+      <w:r>
+        <w:rPr>
+          <w:rFonts w:ascii="Batang" w:hAnsi="Batang" w:eastAsia="Batang" w:cs="Batang"/>
+          <w:color w:val="000000" w:themeColor="text1" w:themeTint="FF" w:themeShade="FF"/>
+          <w:sz w:val="22"/>
+          <w:szCs w:val="22"/>
+        </w:rPr>
+        <w:t>되며</w:t>
+      </w:r>
+      <w:r>
+        <w:rPr>
+          <w:rFonts w:ascii="Batang" w:hAnsi="Batang" w:eastAsia="Batang" w:cs="Batang"/>
+          <w:color w:val="000000" w:themeColor="text1" w:themeTint="FF" w:themeShade="FF"/>
+          <w:sz w:val="22"/>
+          <w:szCs w:val="22"/>
+        </w:rPr>
+        <w:t>,</w:t>
+      </w:r>
+    </w:p>
+    <w:p>
+      <w:pPr>
+        <w:spacing w:after="0" w:line="276" w:lineRule="auto"/>
+        <w:ind w:left="540" w:right="300" w:hanging="540"/>
+        <w:jc w:val="right"/>
+        <w:rPr>
+          <w:rFonts w:ascii="Batang" w:hAnsi="Batang" w:eastAsia="Batang" w:cs="Batang"/>
+          <w:color w:val="000000" w:themeColor="text1" w:themeTint="FF" w:themeShade="FF"/>
+          <w:sz w:val="22"/>
+          <w:szCs w:val="22"/>
+        </w:rPr>
+      </w:pPr>
+      <w:r>
+        <w:rPr>
+          <w:rFonts w:ascii="Batang" w:hAnsi="Batang" w:eastAsia="Batang" w:cs="Batang"/>
+          <w:color w:val="000000" w:themeColor="text1" w:themeTint="FF" w:themeShade="FF"/>
+          <w:sz w:val="22"/>
+          <w:szCs w:val="22"/>
+        </w:rPr>
+        <w:t>경찰서</w:t>
+      </w:r>
+      <w:r>
+        <w:rPr>
+          <w:rFonts w:ascii="Batang" w:hAnsi="Batang" w:eastAsia="Batang" w:cs="Batang"/>
+          <w:color w:val="000000" w:themeColor="text1" w:themeTint="FF" w:themeShade="FF"/>
+          <w:sz w:val="22"/>
+          <w:szCs w:val="22"/>
+        </w:rPr>
+        <w:t xml:space="preserve"> </w:t>
+      </w:r>
+      <w:r>
+        <w:rPr>
+          <w:rFonts w:ascii="Batang" w:hAnsi="Batang" w:eastAsia="Batang" w:cs="Batang"/>
+          <w:color w:val="000000" w:themeColor="text1" w:themeTint="FF" w:themeShade="FF"/>
+          <w:sz w:val="22"/>
+          <w:szCs w:val="22"/>
+        </w:rPr>
+        <w:t>제출시에는</w:t>
+      </w:r>
+      <w:r>
+        <w:rPr>
+          <w:rFonts w:ascii="Batang" w:hAnsi="Batang" w:eastAsia="Batang" w:cs="Batang"/>
+          <w:color w:val="000000" w:themeColor="text1" w:themeTint="FF" w:themeShade="FF"/>
+          <w:sz w:val="22"/>
+          <w:szCs w:val="22"/>
+        </w:rPr>
+        <w:t xml:space="preserve"> ‘</w:t>
+      </w:r>
+      <w:r>
+        <w:rPr>
+          <w:rFonts w:ascii="Batang" w:hAnsi="Batang" w:eastAsia="Batang" w:cs="Batang"/>
+          <w:color w:val="000000" w:themeColor="text1" w:themeTint="FF" w:themeShade="FF"/>
+          <w:sz w:val="22"/>
+          <w:szCs w:val="22"/>
+        </w:rPr>
+        <w:t>OO경찰서</w:t>
+      </w:r>
+      <w:r>
+        <w:rPr>
+          <w:rFonts w:ascii="Batang" w:hAnsi="Batang" w:eastAsia="Batang" w:cs="Batang"/>
+          <w:color w:val="000000" w:themeColor="text1" w:themeTint="FF" w:themeShade="FF"/>
+          <w:sz w:val="22"/>
+          <w:szCs w:val="22"/>
+        </w:rPr>
+        <w:t xml:space="preserve"> </w:t>
+      </w:r>
+      <w:r>
+        <w:rPr>
+          <w:rFonts w:ascii="Batang" w:hAnsi="Batang" w:eastAsia="Batang" w:cs="Batang"/>
+          <w:color w:val="000000" w:themeColor="text1" w:themeTint="FF" w:themeShade="FF"/>
+          <w:sz w:val="22"/>
+          <w:szCs w:val="22"/>
+        </w:rPr>
+        <w:t>귀중’으로</w:t>
+      </w:r>
+      <w:r>
+        <w:rPr>
+          <w:rFonts w:ascii="Batang" w:hAnsi="Batang" w:eastAsia="Batang" w:cs="Batang"/>
+          <w:color w:val="000000" w:themeColor="text1" w:themeTint="FF" w:themeShade="FF"/>
+          <w:sz w:val="22"/>
+          <w:szCs w:val="22"/>
+        </w:rPr>
+        <w:t xml:space="preserve"> 작성하시기 바랍니다.</w:t>
+      </w:r>
+    </w:p>
+    <w:p>
+      <w:pPr>
         <w:widowControl w:val="1"/>
-        <w:wordWrap/>
-        <w:autoSpaceDE/>
-        <w:autoSpaceDN/>
         <w:rPr>
           <w:rFonts w:ascii="Batang" w:hAnsi="Batang" w:eastAsia="Batang" w:cs="Batang"/>
         </w:rPr>

</xml_diff>